<commit_message>
Add assessment numbering and content length checks
</commit_message>
<xml_diff>
--- a/storage/app/templates/rpd/science.docx
+++ b/storage/app/templates/rpd/science.docx
@@ -364,14 +364,6 @@
                 <w:sz w:val="28"/>
               </w:rPr>
             </w:pPr>
-            <w:r>
-              <w:rPr>
-                <w:i/>
-                <w:color w:val="FF0000"/>
-                <w:sz w:val="28"/>
-              </w:rPr>
-              <w:t>ОБРАЗЕЦ</w:t>
-            </w:r>
           </w:p>
         </w:tc>
         <w:tc>
@@ -802,16 +794,6 @@
     </w:p>
     <w:p>
       <w:pPr>
-        <w:jc w:val="center"/>
-        <w:rPr>
-          <w:bCs/>
-          <w:sz w:val="28"/>
-          <w:szCs w:val="28"/>
-        </w:rPr>
-      </w:pPr>
-    </w:p>
-    <w:p>
-      <w:pPr>
         <w:pStyle w:val="Style13"/>
         <w:widowControl/>
         <w:jc w:val="left"/>
@@ -829,13 +811,6 @@
           <w:sz w:val="28"/>
         </w:rPr>
       </w:pPr>
-      <w:r>
-        <w:rPr>
-          <w:sz w:val="28"/>
-          <w:highlight w:val="yellow"/>
-        </w:rPr>
-        <w:t xml:space="preserve">СМКО МИРЭА </w:t>
-      </w:r>
       <w:r>
         <w:rPr>
           <w:sz w:val="28"/>
@@ -967,12 +942,6 @@
           <w:sz w:val="17"/>
         </w:rPr>
         <w:sectPr>
-          <w:headerReference w:type="even" r:id="rId10"/>
-          <w:headerReference w:type="default" r:id="rId11"/>
-          <w:footerReference w:type="even" r:id="rId12"/>
-          <w:footerReference w:type="default" r:id="rId13"/>
-          <w:headerReference w:type="first" r:id="rId14"/>
-          <w:footerReference w:type="first" r:id="rId15"/>
           <w:type w:val="continuous"/>
           <w:pgSz w:w="12090" w:h="16710"/>
           <w:pgMar w:top="1134" w:right="850" w:bottom="1134" w:left="1701" w:header="720" w:footer="720" w:gutter="0"/>
@@ -4576,152 +4545,6 @@
                 <w:sz w:val="24"/>
                 <w:szCs w:val="24"/>
               </w:rPr>
-              <w:t>Итоговая</w:t>
-            </w:r>
-            <w:r>
-              <w:rPr>
-                <w:b/>
-                <w:spacing w:val="39"/>
-                <w:sz w:val="24"/>
-                <w:szCs w:val="24"/>
-              </w:rPr>
-              <w:t xml:space="preserve"> </w:t>
-            </w:r>
-            <w:r>
-              <w:rPr>
-                <w:b/>
-                <w:sz w:val="24"/>
-                <w:szCs w:val="24"/>
-              </w:rPr>
-              <w:t>практическая</w:t>
-            </w:r>
-            <w:r>
-              <w:rPr>
-                <w:b/>
-                <w:spacing w:val="40"/>
-                <w:sz w:val="24"/>
-                <w:szCs w:val="24"/>
-              </w:rPr>
-              <w:t xml:space="preserve"> </w:t>
-            </w:r>
-            <w:r>
-              <w:rPr>
-                <w:b/>
-                <w:spacing w:val="-2"/>
-                <w:sz w:val="24"/>
-                <w:szCs w:val="24"/>
-              </w:rPr>
-              <w:t>работа</w:t>
-            </w:r>
-          </w:p>
-        </w:tc>
-        <w:tc>
-          <w:tcPr>
-            <w:tcW w:w="850" w:type="dxa"/>
-          </w:tcPr>
-          <w:p>
-            <w:pPr>
-              <w:pStyle w:val="TableParagraph"/>
-              <w:jc w:val="center"/>
-              <w:rPr>
-                <w:b/>
-                <w:sz w:val="24"/>
-                <w:szCs w:val="24"/>
-              </w:rPr>
-            </w:pPr>
-          </w:p>
-        </w:tc>
-        <w:tc>
-          <w:tcPr>
-            <w:tcW w:w="992" w:type="dxa"/>
-          </w:tcPr>
-          <w:p>
-            <w:pPr>
-              <w:pStyle w:val="TableParagraph"/>
-              <w:jc w:val="center"/>
-              <w:rPr>
-                <w:sz w:val="24"/>
-                <w:szCs w:val="24"/>
-              </w:rPr>
-            </w:pPr>
-          </w:p>
-        </w:tc>
-        <w:tc>
-          <w:tcPr>
-            <w:tcW w:w="1418" w:type="dxa"/>
-          </w:tcPr>
-          <w:p>
-            <w:pPr>
-              <w:pStyle w:val="TableParagraph"/>
-              <w:jc w:val="center"/>
-              <w:rPr>
-                <w:b/>
-                <w:sz w:val="24"/>
-                <w:szCs w:val="24"/>
-              </w:rPr>
-            </w:pPr>
-          </w:p>
-        </w:tc>
-        <w:tc>
-          <w:tcPr>
-            <w:tcW w:w="1383" w:type="dxa"/>
-          </w:tcPr>
-          <w:p>
-            <w:pPr>
-              <w:pStyle w:val="TableParagraph"/>
-              <w:jc w:val="center"/>
-              <w:rPr>
-                <w:b/>
-                <w:sz w:val="24"/>
-                <w:szCs w:val="24"/>
-              </w:rPr>
-            </w:pPr>
-          </w:p>
-        </w:tc>
-      </w:tr>
-      <w:tr>
-        <w:trPr>
-          <w:trHeight w:val="508"/>
-          <w:jc w:val="center"/>
-        </w:trPr>
-        <w:tc>
-          <w:tcPr>
-            <w:tcW w:w="695" w:type="dxa"/>
-          </w:tcPr>
-          <w:p>
-            <w:pPr>
-              <w:pStyle w:val="TableParagraph"/>
-              <w:jc w:val="both"/>
-              <w:rPr>
-                <w:spacing w:val="-5"/>
-                <w:w w:val="105"/>
-                <w:sz w:val="24"/>
-                <w:szCs w:val="24"/>
-              </w:rPr>
-            </w:pPr>
-          </w:p>
-        </w:tc>
-        <w:tc>
-          <w:tcPr>
-            <w:tcW w:w="4267" w:type="dxa"/>
-          </w:tcPr>
-          <w:p>
-            <w:pPr>
-              <w:pStyle w:val="TableParagraph"/>
-              <w:ind w:left="57" w:right="57"/>
-              <w:jc w:val="both"/>
-              <w:rPr>
-                <w:b/>
-                <w:sz w:val="24"/>
-                <w:szCs w:val="24"/>
-              </w:rPr>
-            </w:pPr>
-            <w:r>
-              <w:rPr>
-                <w:b/>
-                <w:sz w:val="24"/>
-                <w:szCs w:val="24"/>
-              </w:rPr>
               <w:t>ИТОГО</w:t>
             </w:r>
           </w:p>
@@ -11254,22 +11077,17 @@
         <w:t xml:space="preserve">6.7. </w:t>
       </w:r>
       <w:r>
-        <w:rPr>
-          <w:highlight w:val="yellow"/>
-        </w:rPr>
         <w:t>Оценочные</w:t>
       </w:r>
       <w:r>
         <w:rPr>
           <w:spacing w:val="-13"/>
-          <w:highlight w:val="yellow"/>
         </w:rPr>
         <w:t xml:space="preserve"> </w:t>
       </w:r>
       <w:r>
         <w:rPr>
           <w:spacing w:val="-2"/>
-          <w:highlight w:val="yellow"/>
         </w:rPr>
         <w:t>материалы</w:t>
       </w:r>
@@ -11573,9 +11391,6 @@
         <w:t xml:space="preserve">7.1. </w:t>
       </w:r>
       <w:r>
-        <w:rPr>
-          <w:highlight w:val="yellow"/>
-        </w:rPr>
         <w:t>Список</w:t>
       </w:r>
       <w:r>
@@ -11658,9 +11473,6 @@
         <w:t xml:space="preserve">7.2. </w:t>
       </w:r>
       <w:r>
-        <w:rPr>
-          <w:highlight w:val="yellow"/>
-        </w:rPr>
         <w:t>Дополнительная</w:t>
       </w:r>
       <w:r>
@@ -11720,7 +11532,6 @@
       <w:r>
         <w:rPr>
           <w:spacing w:val="-2"/>
-          <w:highlight w:val="yellow"/>
         </w:rPr>
         <w:t>Ресурсы</w:t>
       </w:r>
@@ -12103,7 +11914,7 @@
       </w:pPr>
     </w:p>
     <w:sectPr>
-      <w:footerReference w:type="default" r:id="rId16"/>
+      <w:footerReference w:type="default" r:id="rId10"/>
       <w:pgSz w:w="11900" w:h="16840"/>
       <w:pgMar w:top="1134" w:right="850" w:bottom="1134" w:left="1701" w:header="0" w:footer="763" w:gutter="0"/>
       <w:cols w:space="720"/>
@@ -12132,36 +11943,6 @@
 </file>
 
 <file path=word/footer1.xml><?xml version="1.0" encoding="utf-8"?>
-<w:ftr xmlns:wpc="http://schemas.microsoft.com/office/word/2010/wordprocessingCanvas" xmlns:cx="http://schemas.microsoft.com/office/drawing/2014/chartex" xmlns:cx1="http://schemas.microsoft.com/office/drawing/2015/9/8/chartex" xmlns:cx2="http://schemas.microsoft.com/office/drawing/2015/10/21/chartex" xmlns:cx3="http://schemas.microsoft.com/office/drawing/2016/5/9/chartex" xmlns:cx4="http://schemas.microsoft.com/office/drawing/2016/5/10/chartex" xmlns:cx5="http://schemas.microsoft.com/office/drawing/2016/5/11/chartex" xmlns:cx6="http://schemas.microsoft.com/office/drawing/2016/5/12/chartex" xmlns:cx7="http://schemas.microsoft.com/office/drawing/2016/5/13/chartex" xmlns:cx8="http://schemas.microsoft.com/office/drawing/2016/5/14/chartex" xmlns:mc="http://schemas.openxmlformats.org/markup-compatibility/2006" xmlns:aink="http://schemas.microsoft.com/office/drawing/2016/ink" xmlns:am3d="http://schemas.microsoft.com/office/drawing/2017/model3d" xmlns:o="urn:schemas-microsoft-com:office:office" xmlns:r="http://schemas.openxmlformats.org/officeDocument/2006/relationships" xmlns:m="http://schemas.openxmlformats.org/officeDocument/2006/math" xmlns:v="urn:schemas-microsoft-com:vml" xmlns:wp14="http://schemas.microsoft.com/office/word/2010/wordprocessingDrawing" xmlns:wp="http://schemas.openxmlformats.org/drawingml/2006/wordprocessingDrawing" xmlns:w10="urn:schemas-microsoft-com:office:word" xmlns:w="http://schemas.openxmlformats.org/wordprocessingml/2006/main" xmlns:w14="http://schemas.microsoft.com/office/word/2010/wordml" xmlns:w15="http://schemas.microsoft.com/office/word/2012/wordml" xmlns:w16cex="http://schemas.microsoft.com/office/word/2018/wordml/cex" xmlns:w16cid="http://schemas.microsoft.com/office/word/2016/wordml/cid" xmlns:w16="http://schemas.microsoft.com/office/word/2018/wordml" xmlns:w16sdtdh="http://schemas.microsoft.com/office/word/2020/wordml/sdtdatahash" xmlns:w16se="http://schemas.microsoft.com/office/word/2015/wordml/symex" xmlns:wpg="http://schemas.microsoft.com/office/word/2010/wordprocessingGroup" xmlns:wpi="http://schemas.microsoft.com/office/word/2010/wordprocessingInk" xmlns:wne="http://schemas.microsoft.com/office/word/2006/wordml" xmlns:wps="http://schemas.microsoft.com/office/word/2010/wordprocessingShape" mc:Ignorable="w14 w15 w16se w16cid w16 w16cex w16sdtdh wp14">
-  <w:p>
-    <w:pPr>
-      <w:pStyle w:val="Footer"/>
-    </w:pPr>
-  </w:p>
-</w:ftr>
-</file>
-
-<file path=word/footer2.xml><?xml version="1.0" encoding="utf-8"?>
-<w:ftr xmlns:wpc="http://schemas.microsoft.com/office/word/2010/wordprocessingCanvas" xmlns:cx="http://schemas.microsoft.com/office/drawing/2014/chartex" xmlns:cx1="http://schemas.microsoft.com/office/drawing/2015/9/8/chartex" xmlns:cx2="http://schemas.microsoft.com/office/drawing/2015/10/21/chartex" xmlns:cx3="http://schemas.microsoft.com/office/drawing/2016/5/9/chartex" xmlns:cx4="http://schemas.microsoft.com/office/drawing/2016/5/10/chartex" xmlns:cx5="http://schemas.microsoft.com/office/drawing/2016/5/11/chartex" xmlns:cx6="http://schemas.microsoft.com/office/drawing/2016/5/12/chartex" xmlns:cx7="http://schemas.microsoft.com/office/drawing/2016/5/13/chartex" xmlns:cx8="http://schemas.microsoft.com/office/drawing/2016/5/14/chartex" xmlns:mc="http://schemas.openxmlformats.org/markup-compatibility/2006" xmlns:aink="http://schemas.microsoft.com/office/drawing/2016/ink" xmlns:am3d="http://schemas.microsoft.com/office/drawing/2017/model3d" xmlns:o="urn:schemas-microsoft-com:office:office" xmlns:r="http://schemas.openxmlformats.org/officeDocument/2006/relationships" xmlns:m="http://schemas.openxmlformats.org/officeDocument/2006/math" xmlns:v="urn:schemas-microsoft-com:vml" xmlns:wp14="http://schemas.microsoft.com/office/word/2010/wordprocessingDrawing" xmlns:wp="http://schemas.openxmlformats.org/drawingml/2006/wordprocessingDrawing" xmlns:w10="urn:schemas-microsoft-com:office:word" xmlns:w="http://schemas.openxmlformats.org/wordprocessingml/2006/main" xmlns:w14="http://schemas.microsoft.com/office/word/2010/wordml" xmlns:w15="http://schemas.microsoft.com/office/word/2012/wordml" xmlns:w16cex="http://schemas.microsoft.com/office/word/2018/wordml/cex" xmlns:w16cid="http://schemas.microsoft.com/office/word/2016/wordml/cid" xmlns:w16="http://schemas.microsoft.com/office/word/2018/wordml" xmlns:w16sdtdh="http://schemas.microsoft.com/office/word/2020/wordml/sdtdatahash" xmlns:w16se="http://schemas.microsoft.com/office/word/2015/wordml/symex" xmlns:wpg="http://schemas.microsoft.com/office/word/2010/wordprocessingGroup" xmlns:wpi="http://schemas.microsoft.com/office/word/2010/wordprocessingInk" xmlns:wne="http://schemas.microsoft.com/office/word/2006/wordml" xmlns:wps="http://schemas.microsoft.com/office/word/2010/wordprocessingShape" mc:Ignorable="w14 w15 w16se w16cid w16 w16cex w16sdtdh wp14">
-  <w:p>
-    <w:pPr>
-      <w:pStyle w:val="Footer"/>
-    </w:pPr>
-  </w:p>
-</w:ftr>
-</file>
-
-<file path=word/footer3.xml><?xml version="1.0" encoding="utf-8"?>
-<w:ftr xmlns:wpc="http://schemas.microsoft.com/office/word/2010/wordprocessingCanvas" xmlns:cx="http://schemas.microsoft.com/office/drawing/2014/chartex" xmlns:cx1="http://schemas.microsoft.com/office/drawing/2015/9/8/chartex" xmlns:cx2="http://schemas.microsoft.com/office/drawing/2015/10/21/chartex" xmlns:cx3="http://schemas.microsoft.com/office/drawing/2016/5/9/chartex" xmlns:cx4="http://schemas.microsoft.com/office/drawing/2016/5/10/chartex" xmlns:cx5="http://schemas.microsoft.com/office/drawing/2016/5/11/chartex" xmlns:cx6="http://schemas.microsoft.com/office/drawing/2016/5/12/chartex" xmlns:cx7="http://schemas.microsoft.com/office/drawing/2016/5/13/chartex" xmlns:cx8="http://schemas.microsoft.com/office/drawing/2016/5/14/chartex" xmlns:mc="http://schemas.openxmlformats.org/markup-compatibility/2006" xmlns:aink="http://schemas.microsoft.com/office/drawing/2016/ink" xmlns:am3d="http://schemas.microsoft.com/office/drawing/2017/model3d" xmlns:o="urn:schemas-microsoft-com:office:office" xmlns:r="http://schemas.openxmlformats.org/officeDocument/2006/relationships" xmlns:m="http://schemas.openxmlformats.org/officeDocument/2006/math" xmlns:v="urn:schemas-microsoft-com:vml" xmlns:wp14="http://schemas.microsoft.com/office/word/2010/wordprocessingDrawing" xmlns:wp="http://schemas.openxmlformats.org/drawingml/2006/wordprocessingDrawing" xmlns:w10="urn:schemas-microsoft-com:office:word" xmlns:w="http://schemas.openxmlformats.org/wordprocessingml/2006/main" xmlns:w14="http://schemas.microsoft.com/office/word/2010/wordml" xmlns:w15="http://schemas.microsoft.com/office/word/2012/wordml" xmlns:w16cex="http://schemas.microsoft.com/office/word/2018/wordml/cex" xmlns:w16cid="http://schemas.microsoft.com/office/word/2016/wordml/cid" xmlns:w16="http://schemas.microsoft.com/office/word/2018/wordml" xmlns:w16sdtdh="http://schemas.microsoft.com/office/word/2020/wordml/sdtdatahash" xmlns:w16se="http://schemas.microsoft.com/office/word/2015/wordml/symex" xmlns:wpg="http://schemas.microsoft.com/office/word/2010/wordprocessingGroup" xmlns:wpi="http://schemas.microsoft.com/office/word/2010/wordprocessingInk" xmlns:wne="http://schemas.microsoft.com/office/word/2006/wordml" xmlns:wps="http://schemas.microsoft.com/office/word/2010/wordprocessingShape" mc:Ignorable="w14 w15 w16se w16cid w16 w16cex w16sdtdh wp14">
-  <w:p>
-    <w:pPr>
-      <w:pStyle w:val="Footer"/>
-    </w:pPr>
-  </w:p>
-</w:ftr>
-</file>
-
-<file path=word/footer4.xml><?xml version="1.0" encoding="utf-8"?>
 <w:ftr xmlns:wpc="http://schemas.microsoft.com/office/word/2010/wordprocessingCanvas" xmlns:cx="http://schemas.microsoft.com/office/drawing/2014/chartex" xmlns:cx1="http://schemas.microsoft.com/office/drawing/2015/9/8/chartex" xmlns:cx2="http://schemas.microsoft.com/office/drawing/2015/10/21/chartex" xmlns:cx3="http://schemas.microsoft.com/office/drawing/2016/5/9/chartex" xmlns:cx4="http://schemas.microsoft.com/office/drawing/2016/5/10/chartex" xmlns:cx5="http://schemas.microsoft.com/office/drawing/2016/5/11/chartex" xmlns:cx6="http://schemas.microsoft.com/office/drawing/2016/5/12/chartex" xmlns:cx7="http://schemas.microsoft.com/office/drawing/2016/5/13/chartex" xmlns:cx8="http://schemas.microsoft.com/office/drawing/2016/5/14/chartex" xmlns:mc="http://schemas.openxmlformats.org/markup-compatibility/2006" xmlns:aink="http://schemas.microsoft.com/office/drawing/2016/ink" xmlns:am3d="http://schemas.microsoft.com/office/drawing/2017/model3d" xmlns:o="urn:schemas-microsoft-com:office:office" xmlns:r="http://schemas.openxmlformats.org/officeDocument/2006/relationships" xmlns:m="http://schemas.openxmlformats.org/officeDocument/2006/math" xmlns:v="urn:schemas-microsoft-com:vml" xmlns:wp14="http://schemas.microsoft.com/office/word/2010/wordprocessingDrawing" xmlns:wp="http://schemas.openxmlformats.org/drawingml/2006/wordprocessingDrawing" xmlns:w10="urn:schemas-microsoft-com:office:word" xmlns:w="http://schemas.openxmlformats.org/wordprocessingml/2006/main" xmlns:w14="http://schemas.microsoft.com/office/word/2010/wordml" xmlns:w15="http://schemas.microsoft.com/office/word/2012/wordml" xmlns:w16cex="http://schemas.microsoft.com/office/word/2018/wordml/cex" xmlns:w16cid="http://schemas.microsoft.com/office/word/2016/wordml/cid" xmlns:w16="http://schemas.microsoft.com/office/word/2018/wordml" xmlns:w16sdtdh="http://schemas.microsoft.com/office/word/2020/wordml/sdtdatahash" xmlns:w16se="http://schemas.microsoft.com/office/word/2015/wordml/symex" xmlns:wpg="http://schemas.microsoft.com/office/word/2010/wordprocessingGroup" xmlns:wpi="http://schemas.microsoft.com/office/word/2010/wordprocessingInk" xmlns:wne="http://schemas.microsoft.com/office/word/2006/wordml" xmlns:wps="http://schemas.microsoft.com/office/word/2010/wordprocessingShape" mc:Ignorable="w14 w15 w16se w16cid w16 w16cex w16sdtdh wp14">
   <w:tbl>
     <w:tblPr>
@@ -12311,20 +12092,6 @@
               <w:szCs w:val="20"/>
             </w:rPr>
           </w:pPr>
-          <w:r>
-            <w:rPr>
-              <w:sz w:val="20"/>
-              <w:szCs w:val="20"/>
-            </w:rPr>
-            <w:t>СМКО МИРЭА</w:t>
-          </w:r>
-          <w:r>
-            <w:rPr>
-              <w:sz w:val="24"/>
-              <w:szCs w:val="24"/>
-            </w:rPr>
-            <w:t xml:space="preserve"> </w:t>
-          </w:r>
           <w:r>
             <w:rPr>
               <w:sz w:val="24"/>
@@ -12512,36 +12279,6 @@
     </w:p>
   </w:footnote>
 </w:footnotes>
-</file>
-
-<file path=word/header1.xml><?xml version="1.0" encoding="utf-8"?>
-<w:hdr xmlns:wpc="http://schemas.microsoft.com/office/word/2010/wordprocessingCanvas" xmlns:cx="http://schemas.microsoft.com/office/drawing/2014/chartex" xmlns:cx1="http://schemas.microsoft.com/office/drawing/2015/9/8/chartex" xmlns:cx2="http://schemas.microsoft.com/office/drawing/2015/10/21/chartex" xmlns:cx3="http://schemas.microsoft.com/office/drawing/2016/5/9/chartex" xmlns:cx4="http://schemas.microsoft.com/office/drawing/2016/5/10/chartex" xmlns:cx5="http://schemas.microsoft.com/office/drawing/2016/5/11/chartex" xmlns:cx6="http://schemas.microsoft.com/office/drawing/2016/5/12/chartex" xmlns:cx7="http://schemas.microsoft.com/office/drawing/2016/5/13/chartex" xmlns:cx8="http://schemas.microsoft.com/office/drawing/2016/5/14/chartex" xmlns:mc="http://schemas.openxmlformats.org/markup-compatibility/2006" xmlns:aink="http://schemas.microsoft.com/office/drawing/2016/ink" xmlns:am3d="http://schemas.microsoft.com/office/drawing/2017/model3d" xmlns:o="urn:schemas-microsoft-com:office:office" xmlns:r="http://schemas.openxmlformats.org/officeDocument/2006/relationships" xmlns:m="http://schemas.openxmlformats.org/officeDocument/2006/math" xmlns:v="urn:schemas-microsoft-com:vml" xmlns:wp14="http://schemas.microsoft.com/office/word/2010/wordprocessingDrawing" xmlns:wp="http://schemas.openxmlformats.org/drawingml/2006/wordprocessingDrawing" xmlns:w10="urn:schemas-microsoft-com:office:word" xmlns:w="http://schemas.openxmlformats.org/wordprocessingml/2006/main" xmlns:w14="http://schemas.microsoft.com/office/word/2010/wordml" xmlns:w15="http://schemas.microsoft.com/office/word/2012/wordml" xmlns:w16cex="http://schemas.microsoft.com/office/word/2018/wordml/cex" xmlns:w16cid="http://schemas.microsoft.com/office/word/2016/wordml/cid" xmlns:w16="http://schemas.microsoft.com/office/word/2018/wordml" xmlns:w16sdtdh="http://schemas.microsoft.com/office/word/2020/wordml/sdtdatahash" xmlns:w16se="http://schemas.microsoft.com/office/word/2015/wordml/symex" xmlns:wpg="http://schemas.microsoft.com/office/word/2010/wordprocessingGroup" xmlns:wpi="http://schemas.microsoft.com/office/word/2010/wordprocessingInk" xmlns:wne="http://schemas.microsoft.com/office/word/2006/wordml" xmlns:wps="http://schemas.microsoft.com/office/word/2010/wordprocessingShape" mc:Ignorable="w14 w15 w16se w16cid w16 w16cex w16sdtdh wp14">
-  <w:p>
-    <w:pPr>
-      <w:pStyle w:val="Header"/>
-    </w:pPr>
-  </w:p>
-</w:hdr>
-</file>
-
-<file path=word/header2.xml><?xml version="1.0" encoding="utf-8"?>
-<w:hdr xmlns:wpc="http://schemas.microsoft.com/office/word/2010/wordprocessingCanvas" xmlns:cx="http://schemas.microsoft.com/office/drawing/2014/chartex" xmlns:cx1="http://schemas.microsoft.com/office/drawing/2015/9/8/chartex" xmlns:cx2="http://schemas.microsoft.com/office/drawing/2015/10/21/chartex" xmlns:cx3="http://schemas.microsoft.com/office/drawing/2016/5/9/chartex" xmlns:cx4="http://schemas.microsoft.com/office/drawing/2016/5/10/chartex" xmlns:cx5="http://schemas.microsoft.com/office/drawing/2016/5/11/chartex" xmlns:cx6="http://schemas.microsoft.com/office/drawing/2016/5/12/chartex" xmlns:cx7="http://schemas.microsoft.com/office/drawing/2016/5/13/chartex" xmlns:cx8="http://schemas.microsoft.com/office/drawing/2016/5/14/chartex" xmlns:mc="http://schemas.openxmlformats.org/markup-compatibility/2006" xmlns:aink="http://schemas.microsoft.com/office/drawing/2016/ink" xmlns:am3d="http://schemas.microsoft.com/office/drawing/2017/model3d" xmlns:o="urn:schemas-microsoft-com:office:office" xmlns:r="http://schemas.openxmlformats.org/officeDocument/2006/relationships" xmlns:m="http://schemas.openxmlformats.org/officeDocument/2006/math" xmlns:v="urn:schemas-microsoft-com:vml" xmlns:wp14="http://schemas.microsoft.com/office/word/2010/wordprocessingDrawing" xmlns:wp="http://schemas.openxmlformats.org/drawingml/2006/wordprocessingDrawing" xmlns:w10="urn:schemas-microsoft-com:office:word" xmlns:w="http://schemas.openxmlformats.org/wordprocessingml/2006/main" xmlns:w14="http://schemas.microsoft.com/office/word/2010/wordml" xmlns:w15="http://schemas.microsoft.com/office/word/2012/wordml" xmlns:w16cex="http://schemas.microsoft.com/office/word/2018/wordml/cex" xmlns:w16cid="http://schemas.microsoft.com/office/word/2016/wordml/cid" xmlns:w16="http://schemas.microsoft.com/office/word/2018/wordml" xmlns:w16sdtdh="http://schemas.microsoft.com/office/word/2020/wordml/sdtdatahash" xmlns:w16se="http://schemas.microsoft.com/office/word/2015/wordml/symex" xmlns:wpg="http://schemas.microsoft.com/office/word/2010/wordprocessingGroup" xmlns:wpi="http://schemas.microsoft.com/office/word/2010/wordprocessingInk" xmlns:wne="http://schemas.microsoft.com/office/word/2006/wordml" xmlns:wps="http://schemas.microsoft.com/office/word/2010/wordprocessingShape" mc:Ignorable="w14 w15 w16se w16cid w16 w16cex w16sdtdh wp14">
-  <w:p>
-    <w:pPr>
-      <w:pStyle w:val="Header"/>
-    </w:pPr>
-  </w:p>
-</w:hdr>
-</file>
-
-<file path=word/header3.xml><?xml version="1.0" encoding="utf-8"?>
-<w:hdr xmlns:wpc="http://schemas.microsoft.com/office/word/2010/wordprocessingCanvas" xmlns:cx="http://schemas.microsoft.com/office/drawing/2014/chartex" xmlns:cx1="http://schemas.microsoft.com/office/drawing/2015/9/8/chartex" xmlns:cx2="http://schemas.microsoft.com/office/drawing/2015/10/21/chartex" xmlns:cx3="http://schemas.microsoft.com/office/drawing/2016/5/9/chartex" xmlns:cx4="http://schemas.microsoft.com/office/drawing/2016/5/10/chartex" xmlns:cx5="http://schemas.microsoft.com/office/drawing/2016/5/11/chartex" xmlns:cx6="http://schemas.microsoft.com/office/drawing/2016/5/12/chartex" xmlns:cx7="http://schemas.microsoft.com/office/drawing/2016/5/13/chartex" xmlns:cx8="http://schemas.microsoft.com/office/drawing/2016/5/14/chartex" xmlns:mc="http://schemas.openxmlformats.org/markup-compatibility/2006" xmlns:aink="http://schemas.microsoft.com/office/drawing/2016/ink" xmlns:am3d="http://schemas.microsoft.com/office/drawing/2017/model3d" xmlns:o="urn:schemas-microsoft-com:office:office" xmlns:r="http://schemas.openxmlformats.org/officeDocument/2006/relationships" xmlns:m="http://schemas.openxmlformats.org/officeDocument/2006/math" xmlns:v="urn:schemas-microsoft-com:vml" xmlns:wp14="http://schemas.microsoft.com/office/word/2010/wordprocessingDrawing" xmlns:wp="http://schemas.openxmlformats.org/drawingml/2006/wordprocessingDrawing" xmlns:w10="urn:schemas-microsoft-com:office:word" xmlns:w="http://schemas.openxmlformats.org/wordprocessingml/2006/main" xmlns:w14="http://schemas.microsoft.com/office/word/2010/wordml" xmlns:w15="http://schemas.microsoft.com/office/word/2012/wordml" xmlns:w16cex="http://schemas.microsoft.com/office/word/2018/wordml/cex" xmlns:w16cid="http://schemas.microsoft.com/office/word/2016/wordml/cid" xmlns:w16="http://schemas.microsoft.com/office/word/2018/wordml" xmlns:w16sdtdh="http://schemas.microsoft.com/office/word/2020/wordml/sdtdatahash" xmlns:w16se="http://schemas.microsoft.com/office/word/2015/wordml/symex" xmlns:wpg="http://schemas.microsoft.com/office/word/2010/wordprocessingGroup" xmlns:wpi="http://schemas.microsoft.com/office/word/2010/wordprocessingInk" xmlns:wne="http://schemas.microsoft.com/office/word/2006/wordml" xmlns:wps="http://schemas.microsoft.com/office/word/2010/wordprocessingShape" mc:Ignorable="w14 w15 w16se w16cid w16 w16cex w16sdtdh wp14">
-  <w:p>
-    <w:pPr>
-      <w:pStyle w:val="Header"/>
-    </w:pPr>
-  </w:p>
-</w:hdr>
 </file>
 
 <file path=word/numbering.xml><?xml version="1.0" encoding="utf-8"?>

</xml_diff>

<commit_message>
Improve assessment lists and validation
</commit_message>
<xml_diff>
--- a/storage/app/templates/rpd/science.docx
+++ b/storage/app/templates/rpd/science.docx
@@ -11140,166 +11140,53 @@
     </w:p>
     <w:p>
       <w:pPr>
+        <w:tabs>
+          <w:tab w:val="left" w:pos="1174"/>
+        </w:tabs>
+        <w:jc w:val="both"/>
+        <w:rPr>
+          <w:color w:val="FF0000"/>
+          <w:sz w:val="2"/>
+          <w:szCs w:val="2"/>
+          <w:lang w:val="en-US"/>
+        </w:rPr>
+      </w:pPr>
+      <w:r>
+        <w:rPr>
+          <w:color w:val="FF0000"/>
+          <w:sz w:val="2"/>
+          <w:szCs w:val="2"/>
+          <w:lang w:val="en-US"/>
+        </w:rPr>
+        <w:t>${</w:t>
+      </w:r>
+      <w:proofErr w:type="spellStart"/>
+      <w:r>
+        <w:rPr>
+          <w:color w:val="FF0000"/>
+          <w:sz w:val="2"/>
+          <w:szCs w:val="2"/>
+          <w:lang w:val="en-US"/>
+        </w:rPr>
+        <w:t>control_survey_materials_block</w:t>
+      </w:r>
+      <w:proofErr w:type="spellEnd"/>
+      <w:r>
+        <w:rPr>
+          <w:color w:val="FF0000"/>
+          <w:sz w:val="2"/>
+          <w:szCs w:val="2"/>
+          <w:lang w:val="en-US"/>
+        </w:rPr>
+        <w:t>}</w:t>
+      </w:r>
+    </w:p>
+    <w:p>
+      <w:pPr>
         <w:pStyle w:val="ListParagraph"/>
         <w:numPr>
           <w:ilvl w:val="0"/>
-          <w:numId w:val="2"/>
-        </w:numPr>
-        <w:tabs>
-          <w:tab w:val="left" w:pos="1174"/>
-        </w:tabs>
-        <w:spacing w:line="360" w:lineRule="auto"/>
-        <w:ind w:left="0" w:firstLine="709"/>
-        <w:jc w:val="both"/>
-        <w:rPr>
-          <w:sz w:val="28"/>
-          <w:szCs w:val="28"/>
-        </w:rPr>
-      </w:pPr>
-      <w:r>
-        <w:rPr>
-          <w:sz w:val="28"/>
-          <w:szCs w:val="28"/>
-        </w:rPr>
-        <w:t>${</w:t>
-      </w:r>
-      <w:proofErr w:type="spellStart"/>
-      <w:r>
-        <w:rPr>
-          <w:sz w:val="28"/>
-          <w:szCs w:val="28"/>
-        </w:rPr>
-        <w:t>control_survey_materials</w:t>
-      </w:r>
-      <w:proofErr w:type="spellEnd"/>
-      <w:r>
-        <w:rPr>
-          <w:sz w:val="28"/>
-          <w:szCs w:val="28"/>
-          <w:lang w:val="en-US"/>
-        </w:rPr>
-        <w:t>}</w:t>
-      </w:r>
-    </w:p>
-    <w:p>
-      <w:pPr>
-        <w:pStyle w:val="Heading2"/>
-        <w:spacing w:before="0" w:line="360" w:lineRule="auto"/>
-        <w:ind w:left="0" w:firstLine="709"/>
-        <w:jc w:val="both"/>
-      </w:pPr>
-      <w:r>
-        <w:t>Материалы</w:t>
-      </w:r>
-      <w:r>
-        <w:rPr>
-          <w:spacing w:val="-11"/>
-        </w:rPr>
-        <w:t xml:space="preserve"> </w:t>
-      </w:r>
-      <w:r>
-        <w:t>для</w:t>
-      </w:r>
-      <w:r>
-        <w:rPr>
-          <w:spacing w:val="-12"/>
-        </w:rPr>
-        <w:t xml:space="preserve"> </w:t>
-      </w:r>
-      <w:r>
-        <w:t>проведения</w:t>
-      </w:r>
-      <w:r>
-        <w:rPr>
-          <w:spacing w:val="-12"/>
-        </w:rPr>
-        <w:t xml:space="preserve"> </w:t>
-      </w:r>
-      <w:r>
-        <w:t>итоговой</w:t>
-      </w:r>
-      <w:r>
-        <w:rPr>
-          <w:spacing w:val="-11"/>
-        </w:rPr>
-        <w:t xml:space="preserve"> </w:t>
-      </w:r>
-      <w:r>
-        <w:t>практической</w:t>
-      </w:r>
-      <w:r>
-        <w:rPr>
-          <w:spacing w:val="-12"/>
-        </w:rPr>
-        <w:t xml:space="preserve"> </w:t>
-      </w:r>
-      <w:r>
-        <w:rPr>
-          <w:spacing w:val="-2"/>
-        </w:rPr>
-        <w:t>работы</w:t>
-      </w:r>
-    </w:p>
-    <w:p>
-      <w:pPr>
-        <w:pStyle w:val="ListParagraph"/>
-        <w:numPr>
-          <w:ilvl w:val="0"/>
-          <w:numId w:val="1"/>
-        </w:numPr>
-        <w:tabs>
-          <w:tab w:val="left" w:pos="1174"/>
-        </w:tabs>
-        <w:spacing w:line="360" w:lineRule="auto"/>
-        <w:ind w:left="0" w:firstLine="709"/>
-        <w:jc w:val="both"/>
-        <w:rPr>
-          <w:sz w:val="28"/>
-          <w:szCs w:val="28"/>
-        </w:rPr>
-      </w:pPr>
-      <w:r>
-        <w:rPr>
-          <w:sz w:val="28"/>
-          <w:szCs w:val="28"/>
-        </w:rPr>
-        <w:t>${</w:t>
-      </w:r>
-      <w:proofErr w:type="spellStart"/>
-      <w:r>
-        <w:rPr>
-          <w:sz w:val="28"/>
-          <w:szCs w:val="28"/>
-        </w:rPr>
-        <w:t>final_practical_work_materials</w:t>
-      </w:r>
-      <w:proofErr w:type="spellEnd"/>
-      <w:r>
-        <w:rPr>
-          <w:sz w:val="28"/>
-          <w:szCs w:val="28"/>
-          <w:lang w:val="en-US"/>
-        </w:rPr>
-        <w:t>}</w:t>
-      </w:r>
-    </w:p>
-    <w:p>
-      <w:pPr>
-        <w:pStyle w:val="Heading2"/>
-        <w:spacing w:before="0" w:line="360" w:lineRule="auto"/>
-        <w:ind w:left="0" w:firstLine="709"/>
-        <w:jc w:val="both"/>
-      </w:pPr>
-      <w:r>
-        <w:t>Типовые темы проектных работ</w:t>
-      </w:r>
-    </w:p>
-    <w:p>
-      <w:pPr>
-        <w:pStyle w:val="ListParagraph"/>
-        <w:numPr>
-          <w:ilvl w:val="0"/>
-          <w:numId w:val="28"/>
+          <w:numId w:val="29"/>
         </w:numPr>
         <w:tabs>
           <w:tab w:val="left" w:pos="1174"/>
@@ -11309,12 +11196,14 @@
         <w:rPr>
           <w:sz w:val="28"/>
           <w:szCs w:val="28"/>
-        </w:rPr>
-      </w:pPr>
-      <w:r>
-        <w:rPr>
-          <w:sz w:val="28"/>
-          <w:szCs w:val="28"/>
+          <w:lang w:val="en-US"/>
+        </w:rPr>
+      </w:pPr>
+      <w:r>
+        <w:rPr>
+          <w:sz w:val="28"/>
+          <w:szCs w:val="28"/>
+          <w:lang w:val="en-US"/>
         </w:rPr>
         <w:t>${</w:t>
       </w:r>
@@ -11323,14 +11212,430 @@
         <w:rPr>
           <w:sz w:val="28"/>
           <w:szCs w:val="28"/>
-        </w:rPr>
-        <w:t>project_topics</w:t>
+          <w:lang w:val="en-US"/>
+        </w:rPr>
+        <w:t>control_survey_materials_text</w:t>
       </w:r>
       <w:proofErr w:type="spellEnd"/>
       <w:r>
         <w:rPr>
           <w:sz w:val="28"/>
           <w:szCs w:val="28"/>
+          <w:lang w:val="en-US"/>
+        </w:rPr>
+        <w:t>}</w:t>
+      </w:r>
+    </w:p>
+    <w:p>
+      <w:pPr>
+        <w:tabs>
+          <w:tab w:val="left" w:pos="1174"/>
+        </w:tabs>
+        <w:jc w:val="both"/>
+        <w:rPr>
+          <w:color w:val="FF0000"/>
+          <w:sz w:val="2"/>
+          <w:szCs w:val="2"/>
+        </w:rPr>
+      </w:pPr>
+      <w:r>
+        <w:rPr>
+          <w:color w:val="FF0000"/>
+          <w:sz w:val="2"/>
+          <w:szCs w:val="2"/>
+        </w:rPr>
+        <w:t>${/</w:t>
+      </w:r>
+      <w:proofErr w:type="spellStart"/>
+      <w:r>
+        <w:rPr>
+          <w:color w:val="FF0000"/>
+          <w:sz w:val="2"/>
+          <w:szCs w:val="2"/>
+        </w:rPr>
+        <w:t>control_survey_materials_block</w:t>
+      </w:r>
+      <w:proofErr w:type="spellEnd"/>
+      <w:r>
+        <w:rPr>
+          <w:color w:val="FF0000"/>
+          <w:sz w:val="2"/>
+          <w:szCs w:val="2"/>
+        </w:rPr>
+        <w:t>}</w:t>
+      </w:r>
+    </w:p>
+    <w:p>
+      <w:pPr>
+        <w:pStyle w:val="Heading2"/>
+        <w:spacing w:before="0" w:line="360" w:lineRule="auto"/>
+        <w:ind w:left="0" w:firstLine="709"/>
+        <w:jc w:val="both"/>
+      </w:pPr>
+      <w:r>
+        <w:t>Материалы</w:t>
+      </w:r>
+      <w:r>
+        <w:rPr>
+          <w:spacing w:val="-11"/>
+        </w:rPr>
+        <w:t xml:space="preserve"> </w:t>
+      </w:r>
+      <w:r>
+        <w:t>для</w:t>
+      </w:r>
+      <w:r>
+        <w:rPr>
+          <w:spacing w:val="-12"/>
+        </w:rPr>
+        <w:t xml:space="preserve"> </w:t>
+      </w:r>
+      <w:r>
+        <w:t>проведения</w:t>
+      </w:r>
+      <w:r>
+        <w:rPr>
+          <w:spacing w:val="-12"/>
+        </w:rPr>
+        <w:t xml:space="preserve"> </w:t>
+      </w:r>
+      <w:r>
+        <w:t>итоговой</w:t>
+      </w:r>
+      <w:r>
+        <w:rPr>
+          <w:spacing w:val="-11"/>
+        </w:rPr>
+        <w:t xml:space="preserve"> </w:t>
+      </w:r>
+      <w:r>
+        <w:t>практической</w:t>
+      </w:r>
+      <w:r>
+        <w:rPr>
+          <w:spacing w:val="-12"/>
+        </w:rPr>
+        <w:t xml:space="preserve"> </w:t>
+      </w:r>
+      <w:r>
+        <w:rPr>
+          <w:spacing w:val="-2"/>
+        </w:rPr>
+        <w:t>работы</w:t>
+      </w:r>
+    </w:p>
+    <w:p>
+      <w:pPr>
+        <w:tabs>
+          <w:tab w:val="left" w:pos="1174"/>
+        </w:tabs>
+        <w:jc w:val="both"/>
+        <w:rPr>
+          <w:color w:val="FF0000"/>
+          <w:sz w:val="2"/>
+          <w:szCs w:val="2"/>
+          <w:lang w:val="en-US"/>
+        </w:rPr>
+      </w:pPr>
+      <w:r>
+        <w:rPr>
+          <w:color w:val="FF0000"/>
+          <w:sz w:val="2"/>
+          <w:szCs w:val="2"/>
+          <w:lang w:val="en-US"/>
+        </w:rPr>
+        <w:t>${</w:t>
+      </w:r>
+      <w:proofErr w:type="spellStart"/>
+      <w:r>
+        <w:rPr>
+          <w:color w:val="FF0000"/>
+          <w:sz w:val="2"/>
+          <w:szCs w:val="2"/>
+          <w:lang w:val="en-US"/>
+        </w:rPr>
+        <w:t>final_practical_work_materials_block</w:t>
+      </w:r>
+      <w:proofErr w:type="spellEnd"/>
+      <w:r>
+        <w:rPr>
+          <w:color w:val="FF0000"/>
+          <w:sz w:val="2"/>
+          <w:szCs w:val="2"/>
+          <w:lang w:val="en-US"/>
+        </w:rPr>
+        <w:t>}</w:t>
+      </w:r>
+    </w:p>
+    <w:p>
+      <w:pPr>
+        <w:pStyle w:val="ListParagraph"/>
+        <w:numPr>
+          <w:ilvl w:val="0"/>
+          <w:numId w:val="38"/>
+        </w:numPr>
+        <w:tabs>
+          <w:tab w:val="left" w:pos="1174"/>
+        </w:tabs>
+        <w:spacing w:line="360" w:lineRule="auto"/>
+        <w:jc w:val="both"/>
+        <w:rPr>
+          <w:sz w:val="28"/>
+          <w:szCs w:val="28"/>
+          <w:lang w:val="en-US"/>
+        </w:rPr>
+      </w:pPr>
+      <w:r>
+        <w:rPr>
+          <w:sz w:val="28"/>
+          <w:szCs w:val="28"/>
+          <w:lang w:val="en-US"/>
+        </w:rPr>
+        <w:t>${</w:t>
+      </w:r>
+      <w:proofErr w:type="spellStart"/>
+      <w:r>
+        <w:rPr>
+          <w:sz w:val="28"/>
+          <w:szCs w:val="28"/>
+          <w:lang w:val="en-US"/>
+        </w:rPr>
+        <w:t>final_practical_work_materials_text</w:t>
+      </w:r>
+      <w:proofErr w:type="spellEnd"/>
+      <w:r>
+        <w:rPr>
+          <w:sz w:val="28"/>
+          <w:szCs w:val="28"/>
+          <w:lang w:val="en-US"/>
+        </w:rPr>
+        <w:t>}</w:t>
+      </w:r>
+    </w:p>
+    <w:p>
+      <w:pPr>
+        <w:tabs>
+          <w:tab w:val="left" w:pos="1174"/>
+        </w:tabs>
+        <w:jc w:val="both"/>
+        <w:rPr>
+          <w:color w:val="FF0000"/>
+          <w:sz w:val="2"/>
+          <w:szCs w:val="2"/>
+          <w:lang w:val="en-US"/>
+        </w:rPr>
+      </w:pPr>
+      <w:r>
+        <w:rPr>
+          <w:color w:val="FF0000"/>
+          <w:sz w:val="2"/>
+          <w:szCs w:val="2"/>
+          <w:lang w:val="en-US"/>
+        </w:rPr>
+        <w:t>${/</w:t>
+      </w:r>
+      <w:proofErr w:type="spellStart"/>
+      <w:r>
+        <w:rPr>
+          <w:color w:val="FF0000"/>
+          <w:sz w:val="2"/>
+          <w:szCs w:val="2"/>
+          <w:lang w:val="en-US"/>
+        </w:rPr>
+        <w:t>final_practical_work_materials_block</w:t>
+      </w:r>
+      <w:proofErr w:type="spellEnd"/>
+      <w:r>
+        <w:rPr>
+          <w:color w:val="FF0000"/>
+          <w:sz w:val="2"/>
+          <w:szCs w:val="2"/>
+          <w:lang w:val="en-US"/>
+        </w:rPr>
+        <w:t>}</w:t>
+      </w:r>
+    </w:p>
+    <w:p>
+      <w:pPr>
+        <w:pStyle w:val="Heading2"/>
+        <w:spacing w:before="0" w:line="360" w:lineRule="auto"/>
+        <w:ind w:left="0" w:firstLine="709"/>
+        <w:jc w:val="both"/>
+      </w:pPr>
+      <w:r>
+        <w:t>Типовые</w:t>
+      </w:r>
+      <w:r>
+        <w:t xml:space="preserve"> </w:t>
+      </w:r>
+      <w:r>
+        <w:t>темы</w:t>
+      </w:r>
+      <w:r>
+        <w:t xml:space="preserve"> </w:t>
+      </w:r>
+      <w:r>
+        <w:t>проектных</w:t>
+      </w:r>
+      <w:r>
+        <w:t xml:space="preserve"> </w:t>
+      </w:r>
+      <w:r>
+        <w:t>работ</w:t>
+      </w:r>
+    </w:p>
+    <w:p>
+      <w:pPr>
+        <w:tabs>
+          <w:tab w:val="left" w:pos="709"/>
+        </w:tabs>
+        <w:jc w:val="both"/>
+        <w:rPr>
+          <w:color w:val="FF0000"/>
+          <w:sz w:val="2"/>
+          <w:szCs w:val="2"/>
+        </w:rPr>
+      </w:pPr>
+      <w:r>
+        <w:rPr>
+          <w:color w:val="FF0000"/>
+          <w:sz w:val="2"/>
+          <w:szCs w:val="2"/>
+        </w:rPr>
+        <w:t>${</w:t>
+      </w:r>
+      <w:r>
+        <w:rPr>
+          <w:color w:val="FF0000"/>
+          <w:sz w:val="2"/>
+          <w:szCs w:val="2"/>
+          <w:lang w:val="en-US"/>
+        </w:rPr>
+        <w:t>project</w:t>
+      </w:r>
+      <w:r>
+        <w:rPr>
+          <w:color w:val="FF0000"/>
+          <w:sz w:val="2"/>
+          <w:szCs w:val="2"/>
+        </w:rPr>
+        <w:t>_</w:t>
+      </w:r>
+      <w:r>
+        <w:rPr>
+          <w:color w:val="FF0000"/>
+          <w:sz w:val="2"/>
+          <w:szCs w:val="2"/>
+          <w:lang w:val="en-US"/>
+        </w:rPr>
+        <w:t>topics</w:t>
+      </w:r>
+      <w:r>
+        <w:rPr>
+          <w:color w:val="FF0000"/>
+          <w:sz w:val="2"/>
+          <w:szCs w:val="2"/>
+        </w:rPr>
+        <w:t>_</w:t>
+      </w:r>
+      <w:r>
+        <w:rPr>
+          <w:color w:val="FF0000"/>
+          <w:sz w:val="2"/>
+          <w:szCs w:val="2"/>
+          <w:lang w:val="en-US"/>
+        </w:rPr>
+        <w:t>block</w:t>
+      </w:r>
+      <w:r>
+        <w:rPr>
+          <w:color w:val="FF0000"/>
+          <w:sz w:val="2"/>
+          <w:szCs w:val="2"/>
+        </w:rPr>
+        <w:t>}</w:t>
+      </w:r>
+    </w:p>
+    <w:p>
+      <w:pPr>
+        <w:pStyle w:val="ListParagraph"/>
+        <w:numPr>
+          <w:ilvl w:val="0"/>
+          <w:numId w:val="34"/>
+        </w:numPr>
+        <w:tabs>
+          <w:tab w:val="left" w:pos="709"/>
+        </w:tabs>
+        <w:spacing w:line="360" w:lineRule="auto"/>
+        <w:jc w:val="both"/>
+        <w:rPr>
+          <w:sz w:val="28"/>
+          <w:szCs w:val="28"/>
+          <w:lang w:val="en-US"/>
+        </w:rPr>
+      </w:pPr>
+      <w:r>
+        <w:rPr>
+          <w:sz w:val="28"/>
+          <w:szCs w:val="28"/>
+          <w:lang w:val="en-US"/>
+        </w:rPr>
+        <w:t>${</w:t>
+      </w:r>
+      <w:proofErr w:type="spellStart"/>
+      <w:r>
+        <w:rPr>
+          <w:sz w:val="28"/>
+          <w:szCs w:val="28"/>
+          <w:lang w:val="en-US"/>
+        </w:rPr>
+        <w:t>project_topics_text</w:t>
+      </w:r>
+      <w:proofErr w:type="spellEnd"/>
+      <w:r>
+        <w:rPr>
+          <w:sz w:val="28"/>
+          <w:szCs w:val="28"/>
+          <w:lang w:val="en-US"/>
+        </w:rPr>
+        <w:t>}</w:t>
+      </w:r>
+    </w:p>
+    <w:p>
+      <w:pPr>
+        <w:tabs>
+          <w:tab w:val="left" w:pos="709"/>
+        </w:tabs>
+        <w:jc w:val="both"/>
+        <w:rPr>
+          <w:color w:val="FF0000"/>
+          <w:sz w:val="2"/>
+          <w:szCs w:val="2"/>
+        </w:rPr>
+      </w:pPr>
+      <w:r>
+        <w:rPr>
+          <w:color w:val="FF0000"/>
+          <w:sz w:val="2"/>
+          <w:szCs w:val="2"/>
+        </w:rPr>
+        <w:t>${/</w:t>
+      </w:r>
+      <w:proofErr w:type="spellStart"/>
+      <w:r>
+        <w:rPr>
+          <w:color w:val="FF0000"/>
+          <w:sz w:val="2"/>
+          <w:szCs w:val="2"/>
+        </w:rPr>
+        <w:t>project_topics_block</w:t>
+      </w:r>
+      <w:proofErr w:type="spellEnd"/>
+      <w:r>
+        <w:rPr>
+          <w:color w:val="FF0000"/>
+          <w:sz w:val="2"/>
+          <w:szCs w:val="2"/>
         </w:rPr>
         <w:t>}</w:t>
       </w:r>
@@ -11427,11 +11732,100 @@
     <w:p>
       <w:pPr>
         <w:pStyle w:val="p1"/>
+        <w:jc w:val="both"/>
+        <w:rPr>
+          <w:color w:val="FF0000"/>
+          <w:sz w:val="2"/>
+          <w:szCs w:val="2"/>
+          <w:lang w:val="ru-RU"/>
+        </w:rPr>
+      </w:pPr>
+      <w:r>
+        <w:rPr>
+          <w:color w:val="FF0000"/>
+          <w:sz w:val="2"/>
+          <w:szCs w:val="2"/>
+          <w:lang w:val="ru-RU"/>
+        </w:rPr>
+        <w:t>${</w:t>
+      </w:r>
+      <w:r>
+        <w:rPr>
+          <w:color w:val="FF0000"/>
+          <w:sz w:val="2"/>
+          <w:szCs w:val="2"/>
+        </w:rPr>
+        <w:t>main</w:t>
+      </w:r>
+      <w:r>
+        <w:rPr>
+          <w:color w:val="FF0000"/>
+          <w:sz w:val="2"/>
+          <w:szCs w:val="2"/>
+          <w:lang w:val="ru-RU"/>
+        </w:rPr>
+        <w:t>_</w:t>
+      </w:r>
+      <w:r>
+        <w:rPr>
+          <w:color w:val="FF0000"/>
+          <w:sz w:val="2"/>
+          <w:szCs w:val="2"/>
+        </w:rPr>
+        <w:t>recommended</w:t>
+      </w:r>
+      <w:r>
+        <w:rPr>
+          <w:color w:val="FF0000"/>
+          <w:sz w:val="2"/>
+          <w:szCs w:val="2"/>
+          <w:lang w:val="ru-RU"/>
+        </w:rPr>
+        <w:t>_</w:t>
+      </w:r>
+      <w:r>
+        <w:rPr>
+          <w:color w:val="FF0000"/>
+          <w:sz w:val="2"/>
+          <w:szCs w:val="2"/>
+        </w:rPr>
+        <w:t>resources</w:t>
+      </w:r>
+      <w:r>
+        <w:rPr>
+          <w:color w:val="FF0000"/>
+          <w:sz w:val="2"/>
+          <w:szCs w:val="2"/>
+          <w:lang w:val="ru-RU"/>
+        </w:rPr>
+        <w:t>_</w:t>
+      </w:r>
+      <w:r>
+        <w:rPr>
+          <w:color w:val="FF0000"/>
+          <w:sz w:val="2"/>
+          <w:szCs w:val="2"/>
+        </w:rPr>
+        <w:t>block</w:t>
+      </w:r>
+      <w:r>
+        <w:rPr>
+          <w:color w:val="FF0000"/>
+          <w:sz w:val="2"/>
+          <w:szCs w:val="2"/>
+          <w:lang w:val="ru-RU"/>
+        </w:rPr>
+        <w:t>}</w:t>
+      </w:r>
+    </w:p>
+    <w:p>
+      <w:pPr>
+        <w:pStyle w:val="p1"/>
         <w:numPr>
           <w:ilvl w:val="0"/>
-          <w:numId w:val="25"/>
+          <w:numId w:val="35"/>
         </w:numPr>
-        <w:ind w:hanging="11"/>
+        <w:spacing w:line="360" w:lineRule="auto"/>
         <w:jc w:val="both"/>
         <w:rPr>
           <w:sz w:val="28"/>
@@ -11451,13 +11845,50 @@
           <w:sz w:val="28"/>
           <w:szCs w:val="28"/>
         </w:rPr>
-        <w:t>main_recommended_resources</w:t>
+        <w:t>main_recommended_resources_text</w:t>
       </w:r>
       <w:proofErr w:type="spellEnd"/>
       <w:r>
         <w:rPr>
           <w:sz w:val="28"/>
           <w:szCs w:val="28"/>
+        </w:rPr>
+        <w:t>}</w:t>
+      </w:r>
+    </w:p>
+    <w:p>
+      <w:pPr>
+        <w:pStyle w:val="p1"/>
+        <w:jc w:val="both"/>
+        <w:rPr>
+          <w:color w:val="FF0000"/>
+          <w:sz w:val="2"/>
+          <w:szCs w:val="2"/>
+        </w:rPr>
+      </w:pPr>
+      <w:r>
+        <w:rPr>
+          <w:color w:val="FF0000"/>
+          <w:sz w:val="2"/>
+          <w:szCs w:val="2"/>
+        </w:rPr>
+        <w:t>${/</w:t>
+      </w:r>
+      <w:proofErr w:type="spellStart"/>
+      <w:r>
+        <w:rPr>
+          <w:color w:val="FF0000"/>
+          <w:sz w:val="2"/>
+          <w:szCs w:val="2"/>
+        </w:rPr>
+        <w:t>main_recommended_resources_block</w:t>
+      </w:r>
+      <w:proofErr w:type="spellEnd"/>
+      <w:r>
+        <w:rPr>
+          <w:color w:val="FF0000"/>
+          <w:sz w:val="2"/>
+          <w:szCs w:val="2"/>
         </w:rPr>
         <w:t>}</w:t>
       </w:r>
@@ -11468,25 +11899,74 @@
         <w:spacing w:before="0" w:line="360" w:lineRule="auto"/>
         <w:ind w:left="0" w:firstLine="709"/>
         <w:jc w:val="both"/>
-      </w:pPr>
-      <w:r>
+        <w:rPr>
+          <w:lang w:val="en-US"/>
+        </w:rPr>
+      </w:pPr>
+      <w:r>
+        <w:rPr>
+          <w:lang w:val="en-US"/>
+        </w:rPr>
         <w:t xml:space="preserve">7.2. </w:t>
       </w:r>
       <w:r>
         <w:t>Дополнительная</w:t>
       </w:r>
       <w:r>
-        <w:t xml:space="preserve"> литература</w:t>
-      </w:r>
-    </w:p>
-    <w:p>
-      <w:pPr>
-        <w:pStyle w:val="p1"/>
+        <w:rPr>
+          <w:lang w:val="en-US"/>
+        </w:rPr>
+        <w:t xml:space="preserve"> </w:t>
+      </w:r>
+      <w:r>
+        <w:t>литература</w:t>
+      </w:r>
+    </w:p>
+    <w:p>
+      <w:pPr>
+        <w:pStyle w:val="p2"/>
+        <w:rPr>
+          <w:color w:val="FF0000"/>
+          <w:sz w:val="2"/>
+          <w:szCs w:val="2"/>
+        </w:rPr>
+      </w:pPr>
+      <w:r>
+        <w:rPr>
+          <w:color w:val="FF0000"/>
+          <w:sz w:val="2"/>
+          <w:szCs w:val="2"/>
+        </w:rPr>
+        <w:t>${</w:t>
+      </w:r>
+      <w:proofErr w:type="spellStart"/>
+      <w:r>
+        <w:rPr>
+          <w:color w:val="FF0000"/>
+          <w:sz w:val="2"/>
+          <w:szCs w:val="2"/>
+        </w:rPr>
+        <w:t>additional_resources_block</w:t>
+      </w:r>
+      <w:proofErr w:type="spellEnd"/>
+      <w:r>
+        <w:rPr>
+          <w:color w:val="FF0000"/>
+          <w:sz w:val="2"/>
+          <w:szCs w:val="2"/>
+        </w:rPr>
+        <w:t>}</w:t>
+      </w:r>
+    </w:p>
+    <w:p>
+      <w:pPr>
+        <w:pStyle w:val="p2"/>
         <w:numPr>
           <w:ilvl w:val="0"/>
-          <w:numId w:val="26"/>
+          <w:numId w:val="36"/>
         </w:numPr>
-        <w:ind w:hanging="11"/>
+        <w:spacing w:line="360" w:lineRule="auto"/>
+        <w:jc w:val="both"/>
         <w:rPr>
           <w:sz w:val="28"/>
           <w:szCs w:val="28"/>
@@ -11505,13 +11985,49 @@
           <w:sz w:val="28"/>
           <w:szCs w:val="28"/>
         </w:rPr>
-        <w:t>additional_resources</w:t>
+        <w:t>additional_resources_text</w:t>
       </w:r>
       <w:proofErr w:type="spellEnd"/>
       <w:r>
         <w:rPr>
           <w:sz w:val="28"/>
           <w:szCs w:val="28"/>
+        </w:rPr>
+        <w:t>}</w:t>
+      </w:r>
+    </w:p>
+    <w:p>
+      <w:pPr>
+        <w:pStyle w:val="p2"/>
+        <w:rPr>
+          <w:color w:val="FF0000"/>
+          <w:sz w:val="2"/>
+          <w:szCs w:val="2"/>
+        </w:rPr>
+      </w:pPr>
+      <w:r>
+        <w:rPr>
+          <w:color w:val="FF0000"/>
+          <w:sz w:val="2"/>
+          <w:szCs w:val="2"/>
+        </w:rPr>
+        <w:t>${/</w:t>
+      </w:r>
+      <w:proofErr w:type="spellStart"/>
+      <w:r>
+        <w:rPr>
+          <w:color w:val="FF0000"/>
+          <w:sz w:val="2"/>
+          <w:szCs w:val="2"/>
+        </w:rPr>
+        <w:t>additional_resources_block</w:t>
+      </w:r>
+      <w:proofErr w:type="spellEnd"/>
+      <w:r>
+        <w:rPr>
+          <w:color w:val="FF0000"/>
+          <w:sz w:val="2"/>
+          <w:szCs w:val="2"/>
         </w:rPr>
         <w:t>}</w:t>
       </w:r>
@@ -11574,13 +12090,49 @@
     </w:p>
     <w:p>
       <w:pPr>
-        <w:pStyle w:val="p1"/>
+        <w:pStyle w:val="p2"/>
+        <w:jc w:val="both"/>
+        <w:rPr>
+          <w:color w:val="FF0000"/>
+          <w:sz w:val="2"/>
+          <w:szCs w:val="2"/>
+        </w:rPr>
+      </w:pPr>
+      <w:r>
+        <w:rPr>
+          <w:color w:val="FF0000"/>
+          <w:sz w:val="2"/>
+          <w:szCs w:val="2"/>
+        </w:rPr>
+        <w:t>${</w:t>
+      </w:r>
+      <w:proofErr w:type="spellStart"/>
+      <w:r>
+        <w:rPr>
+          <w:color w:val="FF0000"/>
+          <w:sz w:val="2"/>
+          <w:szCs w:val="2"/>
+        </w:rPr>
+        <w:t>internet_resources_block</w:t>
+      </w:r>
+      <w:proofErr w:type="spellEnd"/>
+      <w:r>
+        <w:rPr>
+          <w:color w:val="FF0000"/>
+          <w:sz w:val="2"/>
+          <w:szCs w:val="2"/>
+        </w:rPr>
+        <w:t>}</w:t>
+      </w:r>
+    </w:p>
+    <w:p>
+      <w:pPr>
+        <w:pStyle w:val="p2"/>
         <w:numPr>
           <w:ilvl w:val="0"/>
-          <w:numId w:val="27"/>
+          <w:numId w:val="37"/>
         </w:numPr>
         <w:spacing w:line="360" w:lineRule="auto"/>
-        <w:ind w:hanging="11"/>
         <w:jc w:val="both"/>
         <w:rPr>
           <w:sz w:val="28"/>
@@ -11600,7 +12152,7 @@
           <w:sz w:val="28"/>
           <w:szCs w:val="28"/>
         </w:rPr>
-        <w:t>internet_resources</w:t>
+        <w:t>internet_resources_text</w:t>
       </w:r>
       <w:proofErr w:type="spellEnd"/>
       <w:r>
@@ -11613,11 +12165,49 @@
     </w:p>
     <w:p>
       <w:pPr>
-        <w:pStyle w:val="Heading2"/>
-        <w:spacing w:before="0" w:line="360" w:lineRule="auto"/>
+        <w:pStyle w:val="p2"/>
         <w:jc w:val="both"/>
         <w:rPr>
-          <w:spacing w:val="-6"/>
+          <w:color w:val="FF0000"/>
+          <w:sz w:val="2"/>
+          <w:szCs w:val="2"/>
+        </w:rPr>
+      </w:pPr>
+      <w:r>
+        <w:rPr>
+          <w:color w:val="FF0000"/>
+          <w:sz w:val="2"/>
+          <w:szCs w:val="2"/>
+        </w:rPr>
+        <w:t>${/</w:t>
+      </w:r>
+      <w:proofErr w:type="spellStart"/>
+      <w:r>
+        <w:rPr>
+          <w:color w:val="FF0000"/>
+          <w:sz w:val="2"/>
+          <w:szCs w:val="2"/>
+        </w:rPr>
+        <w:t>internet_resources_block</w:t>
+      </w:r>
+      <w:proofErr w:type="spellEnd"/>
+      <w:r>
+        <w:rPr>
+          <w:color w:val="FF0000"/>
+          <w:sz w:val="2"/>
+          <w:szCs w:val="2"/>
+        </w:rPr>
+        <w:t>}</w:t>
+      </w:r>
+    </w:p>
+    <w:p>
+      <w:pPr>
+        <w:pStyle w:val="Style13"/>
+        <w:widowControl/>
+        <w:jc w:val="left"/>
+        <w:rPr>
+          <w:sz w:val="28"/>
+          <w:szCs w:val="28"/>
         </w:rPr>
       </w:pPr>
     </w:p>
@@ -11679,6 +12269,7 @@
                 <w:sz w:val="28"/>
                 <w:szCs w:val="28"/>
               </w:rPr>
+              <w:lastRenderedPageBreak/>
               <w:t>${</w:t>
             </w:r>
             <w:proofErr w:type="spellStart"/>
@@ -12284,6 +12875,92 @@
 <file path=word/numbering.xml><?xml version="1.0" encoding="utf-8"?>
 <w:numbering xmlns:wpc="http://schemas.microsoft.com/office/word/2010/wordprocessingCanvas" xmlns:cx="http://schemas.microsoft.com/office/drawing/2014/chartex" xmlns:cx1="http://schemas.microsoft.com/office/drawing/2015/9/8/chartex" xmlns:cx2="http://schemas.microsoft.com/office/drawing/2015/10/21/chartex" xmlns:cx3="http://schemas.microsoft.com/office/drawing/2016/5/9/chartex" xmlns:cx4="http://schemas.microsoft.com/office/drawing/2016/5/10/chartex" xmlns:cx5="http://schemas.microsoft.com/office/drawing/2016/5/11/chartex" xmlns:cx6="http://schemas.microsoft.com/office/drawing/2016/5/12/chartex" xmlns:cx7="http://schemas.microsoft.com/office/drawing/2016/5/13/chartex" xmlns:cx8="http://schemas.microsoft.com/office/drawing/2016/5/14/chartex" xmlns:mc="http://schemas.openxmlformats.org/markup-compatibility/2006" xmlns:aink="http://schemas.microsoft.com/office/drawing/2016/ink" xmlns:am3d="http://schemas.microsoft.com/office/drawing/2017/model3d" xmlns:o="urn:schemas-microsoft-com:office:office" xmlns:r="http://schemas.openxmlformats.org/officeDocument/2006/relationships" xmlns:m="http://schemas.openxmlformats.org/officeDocument/2006/math" xmlns:v="urn:schemas-microsoft-com:vml" xmlns:wp14="http://schemas.microsoft.com/office/word/2010/wordprocessingDrawing" xmlns:wp="http://schemas.openxmlformats.org/drawingml/2006/wordprocessingDrawing" xmlns:w10="urn:schemas-microsoft-com:office:word" xmlns:w="http://schemas.openxmlformats.org/wordprocessingml/2006/main" xmlns:w14="http://schemas.microsoft.com/office/word/2010/wordml" xmlns:w15="http://schemas.microsoft.com/office/word/2012/wordml" xmlns:w16cex="http://schemas.microsoft.com/office/word/2018/wordml/cex" xmlns:w16cid="http://schemas.microsoft.com/office/word/2016/wordml/cid" xmlns:w16="http://schemas.microsoft.com/office/word/2018/wordml" xmlns:w16sdtdh="http://schemas.microsoft.com/office/word/2020/wordml/sdtdatahash" xmlns:w16se="http://schemas.microsoft.com/office/word/2015/wordml/symex" xmlns:wpg="http://schemas.microsoft.com/office/word/2010/wordprocessingGroup" xmlns:wpi="http://schemas.microsoft.com/office/word/2010/wordprocessingInk" xmlns:wne="http://schemas.microsoft.com/office/word/2006/wordml" xmlns:wps="http://schemas.microsoft.com/office/word/2010/wordprocessingShape" mc:Ignorable="w14 w15 w16se w16cid w16 w16cex w16sdtdh wp14">
   <w:abstractNum w:abstractNumId="0" w15:restartNumberingAfterBreak="0">
+    <w:nsid w:val="021C1F76"/>
+    <w:multiLevelType w:val="hybridMultilevel"/>
+    <w:tmpl w:val="569C13AA"/>
+    <w:lvl w:ilvl="0" w:tplc="FFFFFFFF">
+      <w:start w:val="1"/>
+      <w:numFmt w:val="decimal"/>
+      <w:lvlText w:val="%1."/>
+      <w:lvlJc w:val="left"/>
+      <w:pPr>
+        <w:ind w:left="720" w:hanging="360"/>
+      </w:pPr>
+    </w:lvl>
+    <w:lvl w:ilvl="1" w:tplc="FFFFFFFF" w:tentative="1">
+      <w:start w:val="1"/>
+      <w:numFmt w:val="lowerLetter"/>
+      <w:lvlText w:val="%2."/>
+      <w:lvlJc w:val="left"/>
+      <w:pPr>
+        <w:ind w:left="1440" w:hanging="360"/>
+      </w:pPr>
+    </w:lvl>
+    <w:lvl w:ilvl="2" w:tplc="FFFFFFFF" w:tentative="1">
+      <w:start w:val="1"/>
+      <w:numFmt w:val="lowerRoman"/>
+      <w:lvlText w:val="%3."/>
+      <w:lvlJc w:val="right"/>
+      <w:pPr>
+        <w:ind w:left="2160" w:hanging="180"/>
+      </w:pPr>
+    </w:lvl>
+    <w:lvl w:ilvl="3" w:tplc="FFFFFFFF" w:tentative="1">
+      <w:start w:val="1"/>
+      <w:numFmt w:val="decimal"/>
+      <w:lvlText w:val="%4."/>
+      <w:lvlJc w:val="left"/>
+      <w:pPr>
+        <w:ind w:left="2880" w:hanging="360"/>
+      </w:pPr>
+    </w:lvl>
+    <w:lvl w:ilvl="4" w:tplc="FFFFFFFF" w:tentative="1">
+      <w:start w:val="1"/>
+      <w:numFmt w:val="lowerLetter"/>
+      <w:lvlText w:val="%5."/>
+      <w:lvlJc w:val="left"/>
+      <w:pPr>
+        <w:ind w:left="3600" w:hanging="360"/>
+      </w:pPr>
+    </w:lvl>
+    <w:lvl w:ilvl="5" w:tplc="FFFFFFFF" w:tentative="1">
+      <w:start w:val="1"/>
+      <w:numFmt w:val="lowerRoman"/>
+      <w:lvlText w:val="%6."/>
+      <w:lvlJc w:val="right"/>
+      <w:pPr>
+        <w:ind w:left="4320" w:hanging="180"/>
+      </w:pPr>
+    </w:lvl>
+    <w:lvl w:ilvl="6" w:tplc="FFFFFFFF" w:tentative="1">
+      <w:start w:val="1"/>
+      <w:numFmt w:val="decimal"/>
+      <w:lvlText w:val="%7."/>
+      <w:lvlJc w:val="left"/>
+      <w:pPr>
+        <w:ind w:left="5040" w:hanging="360"/>
+      </w:pPr>
+    </w:lvl>
+    <w:lvl w:ilvl="7" w:tplc="FFFFFFFF" w:tentative="1">
+      <w:start w:val="1"/>
+      <w:numFmt w:val="lowerLetter"/>
+      <w:lvlText w:val="%8."/>
+      <w:lvlJc w:val="left"/>
+      <w:pPr>
+        <w:ind w:left="5760" w:hanging="360"/>
+      </w:pPr>
+    </w:lvl>
+    <w:lvl w:ilvl="8" w:tplc="FFFFFFFF" w:tentative="1">
+      <w:start w:val="1"/>
+      <w:numFmt w:val="lowerRoman"/>
+      <w:lvlText w:val="%9."/>
+      <w:lvlJc w:val="right"/>
+      <w:pPr>
+        <w:ind w:left="6480" w:hanging="180"/>
+      </w:pPr>
+    </w:lvl>
+  </w:abstractNum>
+  <w:abstractNum w:abstractNumId="1" w15:restartNumberingAfterBreak="0">
     <w:nsid w:val="03C54101"/>
     <w:multiLevelType w:val="hybridMultilevel"/>
     <w:tmpl w:val="0E5E7C16"/>
@@ -12405,7 +13082,7 @@
       </w:rPr>
     </w:lvl>
   </w:abstractNum>
-  <w:abstractNum w:abstractNumId="1" w15:restartNumberingAfterBreak="0">
+  <w:abstractNum w:abstractNumId="2" w15:restartNumberingAfterBreak="0">
     <w:nsid w:val="052C17DB"/>
     <w:multiLevelType w:val="hybridMultilevel"/>
     <w:tmpl w:val="71EE20FE"/>
@@ -12527,7 +13204,7 @@
       </w:rPr>
     </w:lvl>
   </w:abstractNum>
-  <w:abstractNum w:abstractNumId="2" w15:restartNumberingAfterBreak="0">
+  <w:abstractNum w:abstractNumId="3" w15:restartNumberingAfterBreak="0">
     <w:nsid w:val="06883BBF"/>
     <w:multiLevelType w:val="hybridMultilevel"/>
     <w:tmpl w:val="B08C6DB4"/>
@@ -12649,7 +13326,7 @@
       </w:rPr>
     </w:lvl>
   </w:abstractNum>
-  <w:abstractNum w:abstractNumId="3" w15:restartNumberingAfterBreak="0">
+  <w:abstractNum w:abstractNumId="4" w15:restartNumberingAfterBreak="0">
     <w:nsid w:val="0C1B242F"/>
     <w:multiLevelType w:val="hybridMultilevel"/>
     <w:tmpl w:val="B0ECDC96"/>
@@ -12781,7 +13458,7 @@
       </w:rPr>
     </w:lvl>
   </w:abstractNum>
-  <w:abstractNum w:abstractNumId="4" w15:restartNumberingAfterBreak="0">
+  <w:abstractNum w:abstractNumId="5" w15:restartNumberingAfterBreak="0">
     <w:nsid w:val="0C6C4219"/>
     <w:multiLevelType w:val="hybridMultilevel"/>
     <w:tmpl w:val="FF7006B0"/>
@@ -12913,7 +13590,7 @@
       </w:rPr>
     </w:lvl>
   </w:abstractNum>
-  <w:abstractNum w:abstractNumId="5" w15:restartNumberingAfterBreak="0">
+  <w:abstractNum w:abstractNumId="6" w15:restartNumberingAfterBreak="0">
     <w:nsid w:val="1F7036A7"/>
     <w:multiLevelType w:val="hybridMultilevel"/>
     <w:tmpl w:val="DA268C62"/>
@@ -13027,7 +13704,7 @@
       </w:rPr>
     </w:lvl>
   </w:abstractNum>
-  <w:abstractNum w:abstractNumId="6" w15:restartNumberingAfterBreak="0">
+  <w:abstractNum w:abstractNumId="7" w15:restartNumberingAfterBreak="0">
     <w:nsid w:val="200343FA"/>
     <w:multiLevelType w:val="hybridMultilevel"/>
     <w:tmpl w:val="1D8CDDEA"/>
@@ -13149,10 +13826,96 @@
       </w:rPr>
     </w:lvl>
   </w:abstractNum>
-  <w:abstractNum w:abstractNumId="7" w15:restartNumberingAfterBreak="0">
+  <w:abstractNum w:abstractNumId="8" w15:restartNumberingAfterBreak="0">
+    <w:nsid w:val="2350738F"/>
+    <w:multiLevelType w:val="hybridMultilevel"/>
+    <w:tmpl w:val="B9D4A840"/>
+    <w:lvl w:ilvl="0" w:tplc="FFFFFFFF">
+      <w:start w:val="1"/>
+      <w:numFmt w:val="decimal"/>
+      <w:lvlText w:val="%1."/>
+      <w:lvlJc w:val="left"/>
+      <w:pPr>
+        <w:ind w:left="720" w:hanging="360"/>
+      </w:pPr>
+    </w:lvl>
+    <w:lvl w:ilvl="1" w:tplc="FFFFFFFF" w:tentative="1">
+      <w:start w:val="1"/>
+      <w:numFmt w:val="lowerLetter"/>
+      <w:lvlText w:val="%2."/>
+      <w:lvlJc w:val="left"/>
+      <w:pPr>
+        <w:ind w:left="1440" w:hanging="360"/>
+      </w:pPr>
+    </w:lvl>
+    <w:lvl w:ilvl="2" w:tplc="FFFFFFFF" w:tentative="1">
+      <w:start w:val="1"/>
+      <w:numFmt w:val="lowerRoman"/>
+      <w:lvlText w:val="%3."/>
+      <w:lvlJc w:val="right"/>
+      <w:pPr>
+        <w:ind w:left="2160" w:hanging="180"/>
+      </w:pPr>
+    </w:lvl>
+    <w:lvl w:ilvl="3" w:tplc="FFFFFFFF" w:tentative="1">
+      <w:start w:val="1"/>
+      <w:numFmt w:val="decimal"/>
+      <w:lvlText w:val="%4."/>
+      <w:lvlJc w:val="left"/>
+      <w:pPr>
+        <w:ind w:left="2880" w:hanging="360"/>
+      </w:pPr>
+    </w:lvl>
+    <w:lvl w:ilvl="4" w:tplc="FFFFFFFF" w:tentative="1">
+      <w:start w:val="1"/>
+      <w:numFmt w:val="lowerLetter"/>
+      <w:lvlText w:val="%5."/>
+      <w:lvlJc w:val="left"/>
+      <w:pPr>
+        <w:ind w:left="3600" w:hanging="360"/>
+      </w:pPr>
+    </w:lvl>
+    <w:lvl w:ilvl="5" w:tplc="FFFFFFFF" w:tentative="1">
+      <w:start w:val="1"/>
+      <w:numFmt w:val="lowerRoman"/>
+      <w:lvlText w:val="%6."/>
+      <w:lvlJc w:val="right"/>
+      <w:pPr>
+        <w:ind w:left="4320" w:hanging="180"/>
+      </w:pPr>
+    </w:lvl>
+    <w:lvl w:ilvl="6" w:tplc="FFFFFFFF" w:tentative="1">
+      <w:start w:val="1"/>
+      <w:numFmt w:val="decimal"/>
+      <w:lvlText w:val="%7."/>
+      <w:lvlJc w:val="left"/>
+      <w:pPr>
+        <w:ind w:left="5040" w:hanging="360"/>
+      </w:pPr>
+    </w:lvl>
+    <w:lvl w:ilvl="7" w:tplc="FFFFFFFF" w:tentative="1">
+      <w:start w:val="1"/>
+      <w:numFmt w:val="lowerLetter"/>
+      <w:lvlText w:val="%8."/>
+      <w:lvlJc w:val="left"/>
+      <w:pPr>
+        <w:ind w:left="5760" w:hanging="360"/>
+      </w:pPr>
+    </w:lvl>
+    <w:lvl w:ilvl="8" w:tplc="FFFFFFFF" w:tentative="1">
+      <w:start w:val="1"/>
+      <w:numFmt w:val="lowerRoman"/>
+      <w:lvlText w:val="%9."/>
+      <w:lvlJc w:val="right"/>
+      <w:pPr>
+        <w:ind w:left="6480" w:hanging="180"/>
+      </w:pPr>
+    </w:lvl>
+  </w:abstractNum>
+  <w:abstractNum w:abstractNumId="9" w15:restartNumberingAfterBreak="0">
     <w:nsid w:val="24811E78"/>
     <w:multiLevelType w:val="hybridMultilevel"/>
-    <w:tmpl w:val="DF4271BC"/>
+    <w:tmpl w:val="B9E2BD3E"/>
     <w:lvl w:ilvl="0" w:tplc="9D02D4D8">
       <w:start w:val="1"/>
       <w:numFmt w:val="decimal"/>
@@ -13280,7 +14043,7 @@
       </w:rPr>
     </w:lvl>
   </w:abstractNum>
-  <w:abstractNum w:abstractNumId="8" w15:restartNumberingAfterBreak="0">
+  <w:abstractNum w:abstractNumId="10" w15:restartNumberingAfterBreak="0">
     <w:nsid w:val="26151DAC"/>
     <w:multiLevelType w:val="hybridMultilevel"/>
     <w:tmpl w:val="250C9F16"/>
@@ -13394,7 +14157,93 @@
       </w:rPr>
     </w:lvl>
   </w:abstractNum>
-  <w:abstractNum w:abstractNumId="9" w15:restartNumberingAfterBreak="0">
+  <w:abstractNum w:abstractNumId="11" w15:restartNumberingAfterBreak="0">
+    <w:nsid w:val="27CD2904"/>
+    <w:multiLevelType w:val="hybridMultilevel"/>
+    <w:tmpl w:val="5B82E648"/>
+    <w:lvl w:ilvl="0" w:tplc="FFFFFFFF">
+      <w:start w:val="1"/>
+      <w:numFmt w:val="decimal"/>
+      <w:lvlText w:val="%1."/>
+      <w:lvlJc w:val="left"/>
+      <w:pPr>
+        <w:ind w:left="720" w:hanging="360"/>
+      </w:pPr>
+    </w:lvl>
+    <w:lvl w:ilvl="1" w:tplc="FFFFFFFF" w:tentative="1">
+      <w:start w:val="1"/>
+      <w:numFmt w:val="lowerLetter"/>
+      <w:lvlText w:val="%2."/>
+      <w:lvlJc w:val="left"/>
+      <w:pPr>
+        <w:ind w:left="1440" w:hanging="360"/>
+      </w:pPr>
+    </w:lvl>
+    <w:lvl w:ilvl="2" w:tplc="FFFFFFFF" w:tentative="1">
+      <w:start w:val="1"/>
+      <w:numFmt w:val="lowerRoman"/>
+      <w:lvlText w:val="%3."/>
+      <w:lvlJc w:val="right"/>
+      <w:pPr>
+        <w:ind w:left="2160" w:hanging="180"/>
+      </w:pPr>
+    </w:lvl>
+    <w:lvl w:ilvl="3" w:tplc="FFFFFFFF" w:tentative="1">
+      <w:start w:val="1"/>
+      <w:numFmt w:val="decimal"/>
+      <w:lvlText w:val="%4."/>
+      <w:lvlJc w:val="left"/>
+      <w:pPr>
+        <w:ind w:left="2880" w:hanging="360"/>
+      </w:pPr>
+    </w:lvl>
+    <w:lvl w:ilvl="4" w:tplc="FFFFFFFF" w:tentative="1">
+      <w:start w:val="1"/>
+      <w:numFmt w:val="lowerLetter"/>
+      <w:lvlText w:val="%5."/>
+      <w:lvlJc w:val="left"/>
+      <w:pPr>
+        <w:ind w:left="3600" w:hanging="360"/>
+      </w:pPr>
+    </w:lvl>
+    <w:lvl w:ilvl="5" w:tplc="FFFFFFFF" w:tentative="1">
+      <w:start w:val="1"/>
+      <w:numFmt w:val="lowerRoman"/>
+      <w:lvlText w:val="%6."/>
+      <w:lvlJc w:val="right"/>
+      <w:pPr>
+        <w:ind w:left="4320" w:hanging="180"/>
+      </w:pPr>
+    </w:lvl>
+    <w:lvl w:ilvl="6" w:tplc="FFFFFFFF" w:tentative="1">
+      <w:start w:val="1"/>
+      <w:numFmt w:val="decimal"/>
+      <w:lvlText w:val="%7."/>
+      <w:lvlJc w:val="left"/>
+      <w:pPr>
+        <w:ind w:left="5040" w:hanging="360"/>
+      </w:pPr>
+    </w:lvl>
+    <w:lvl w:ilvl="7" w:tplc="FFFFFFFF" w:tentative="1">
+      <w:start w:val="1"/>
+      <w:numFmt w:val="lowerLetter"/>
+      <w:lvlText w:val="%8."/>
+      <w:lvlJc w:val="left"/>
+      <w:pPr>
+        <w:ind w:left="5760" w:hanging="360"/>
+      </w:pPr>
+    </w:lvl>
+    <w:lvl w:ilvl="8" w:tplc="FFFFFFFF" w:tentative="1">
+      <w:start w:val="1"/>
+      <w:numFmt w:val="lowerRoman"/>
+      <w:lvlText w:val="%9."/>
+      <w:lvlJc w:val="right"/>
+      <w:pPr>
+        <w:ind w:left="6480" w:hanging="180"/>
+      </w:pPr>
+    </w:lvl>
+  </w:abstractNum>
+  <w:abstractNum w:abstractNumId="12" w15:restartNumberingAfterBreak="0">
     <w:nsid w:val="280155E9"/>
     <w:multiLevelType w:val="hybridMultilevel"/>
     <w:tmpl w:val="3B463A14"/>
@@ -13517,7 +14366,7 @@
       </w:rPr>
     </w:lvl>
   </w:abstractNum>
-  <w:abstractNum w:abstractNumId="10" w15:restartNumberingAfterBreak="0">
+  <w:abstractNum w:abstractNumId="13" w15:restartNumberingAfterBreak="0">
     <w:nsid w:val="2C7821EA"/>
     <w:multiLevelType w:val="hybridMultilevel"/>
     <w:tmpl w:val="8D080B40"/>
@@ -13639,7 +14488,7 @@
       </w:rPr>
     </w:lvl>
   </w:abstractNum>
-  <w:abstractNum w:abstractNumId="11" w15:restartNumberingAfterBreak="0">
+  <w:abstractNum w:abstractNumId="14" w15:restartNumberingAfterBreak="0">
     <w:nsid w:val="34027608"/>
     <w:multiLevelType w:val="hybridMultilevel"/>
     <w:tmpl w:val="E3D636A0"/>
@@ -13752,7 +14601,7 @@
       </w:rPr>
     </w:lvl>
   </w:abstractNum>
-  <w:abstractNum w:abstractNumId="12" w15:restartNumberingAfterBreak="0">
+  <w:abstractNum w:abstractNumId="15" w15:restartNumberingAfterBreak="0">
     <w:nsid w:val="3A9D4D2C"/>
     <w:multiLevelType w:val="hybridMultilevel"/>
     <w:tmpl w:val="8DFC96FE"/>
@@ -13884,7 +14733,7 @@
       </w:rPr>
     </w:lvl>
   </w:abstractNum>
-  <w:abstractNum w:abstractNumId="13" w15:restartNumberingAfterBreak="0">
+  <w:abstractNum w:abstractNumId="16" w15:restartNumberingAfterBreak="0">
     <w:nsid w:val="3B171755"/>
     <w:multiLevelType w:val="hybridMultilevel"/>
     <w:tmpl w:val="A96ABB8C"/>
@@ -14006,7 +14855,7 @@
       </w:rPr>
     </w:lvl>
   </w:abstractNum>
-  <w:abstractNum w:abstractNumId="14" w15:restartNumberingAfterBreak="0">
+  <w:abstractNum w:abstractNumId="17" w15:restartNumberingAfterBreak="0">
     <w:nsid w:val="3CAA7A89"/>
     <w:multiLevelType w:val="hybridMultilevel"/>
     <w:tmpl w:val="81B6BC48"/>
@@ -14092,7 +14941,93 @@
       </w:pPr>
     </w:lvl>
   </w:abstractNum>
-  <w:abstractNum w:abstractNumId="15" w15:restartNumberingAfterBreak="0">
+  <w:abstractNum w:abstractNumId="18" w15:restartNumberingAfterBreak="0">
+    <w:nsid w:val="3CBE73FD"/>
+    <w:multiLevelType w:val="hybridMultilevel"/>
+    <w:tmpl w:val="CB6EF770"/>
+    <w:lvl w:ilvl="0" w:tplc="FFFFFFFF">
+      <w:start w:val="1"/>
+      <w:numFmt w:val="decimal"/>
+      <w:lvlText w:val="%1."/>
+      <w:lvlJc w:val="left"/>
+      <w:pPr>
+        <w:ind w:left="720" w:hanging="360"/>
+      </w:pPr>
+    </w:lvl>
+    <w:lvl w:ilvl="1" w:tplc="FFFFFFFF" w:tentative="1">
+      <w:start w:val="1"/>
+      <w:numFmt w:val="lowerLetter"/>
+      <w:lvlText w:val="%2."/>
+      <w:lvlJc w:val="left"/>
+      <w:pPr>
+        <w:ind w:left="1440" w:hanging="360"/>
+      </w:pPr>
+    </w:lvl>
+    <w:lvl w:ilvl="2" w:tplc="FFFFFFFF" w:tentative="1">
+      <w:start w:val="1"/>
+      <w:numFmt w:val="lowerRoman"/>
+      <w:lvlText w:val="%3."/>
+      <w:lvlJc w:val="right"/>
+      <w:pPr>
+        <w:ind w:left="2160" w:hanging="180"/>
+      </w:pPr>
+    </w:lvl>
+    <w:lvl w:ilvl="3" w:tplc="FFFFFFFF" w:tentative="1">
+      <w:start w:val="1"/>
+      <w:numFmt w:val="decimal"/>
+      <w:lvlText w:val="%4."/>
+      <w:lvlJc w:val="left"/>
+      <w:pPr>
+        <w:ind w:left="2880" w:hanging="360"/>
+      </w:pPr>
+    </w:lvl>
+    <w:lvl w:ilvl="4" w:tplc="FFFFFFFF" w:tentative="1">
+      <w:start w:val="1"/>
+      <w:numFmt w:val="lowerLetter"/>
+      <w:lvlText w:val="%5."/>
+      <w:lvlJc w:val="left"/>
+      <w:pPr>
+        <w:ind w:left="3600" w:hanging="360"/>
+      </w:pPr>
+    </w:lvl>
+    <w:lvl w:ilvl="5" w:tplc="FFFFFFFF" w:tentative="1">
+      <w:start w:val="1"/>
+      <w:numFmt w:val="lowerRoman"/>
+      <w:lvlText w:val="%6."/>
+      <w:lvlJc w:val="right"/>
+      <w:pPr>
+        <w:ind w:left="4320" w:hanging="180"/>
+      </w:pPr>
+    </w:lvl>
+    <w:lvl w:ilvl="6" w:tplc="FFFFFFFF" w:tentative="1">
+      <w:start w:val="1"/>
+      <w:numFmt w:val="decimal"/>
+      <w:lvlText w:val="%7."/>
+      <w:lvlJc w:val="left"/>
+      <w:pPr>
+        <w:ind w:left="5040" w:hanging="360"/>
+      </w:pPr>
+    </w:lvl>
+    <w:lvl w:ilvl="7" w:tplc="FFFFFFFF" w:tentative="1">
+      <w:start w:val="1"/>
+      <w:numFmt w:val="lowerLetter"/>
+      <w:lvlText w:val="%8."/>
+      <w:lvlJc w:val="left"/>
+      <w:pPr>
+        <w:ind w:left="5760" w:hanging="360"/>
+      </w:pPr>
+    </w:lvl>
+    <w:lvl w:ilvl="8" w:tplc="FFFFFFFF" w:tentative="1">
+      <w:start w:val="1"/>
+      <w:numFmt w:val="lowerRoman"/>
+      <w:lvlText w:val="%9."/>
+      <w:lvlJc w:val="right"/>
+      <w:pPr>
+        <w:ind w:left="6480" w:hanging="180"/>
+      </w:pPr>
+    </w:lvl>
+  </w:abstractNum>
+  <w:abstractNum w:abstractNumId="19" w15:restartNumberingAfterBreak="0">
     <w:nsid w:val="3EFD3A6C"/>
     <w:multiLevelType w:val="hybridMultilevel"/>
     <w:tmpl w:val="1320FA92"/>
@@ -14213,7 +15148,7 @@
       </w:rPr>
     </w:lvl>
   </w:abstractNum>
-  <w:abstractNum w:abstractNumId="16" w15:restartNumberingAfterBreak="0">
+  <w:abstractNum w:abstractNumId="20" w15:restartNumberingAfterBreak="0">
     <w:nsid w:val="46BF6007"/>
     <w:multiLevelType w:val="hybridMultilevel"/>
     <w:tmpl w:val="8E00FBB8"/>
@@ -14327,7 +15262,7 @@
       </w:rPr>
     </w:lvl>
   </w:abstractNum>
-  <w:abstractNum w:abstractNumId="17" w15:restartNumberingAfterBreak="0">
+  <w:abstractNum w:abstractNumId="21" w15:restartNumberingAfterBreak="0">
     <w:nsid w:val="48953B6D"/>
     <w:multiLevelType w:val="hybridMultilevel"/>
     <w:tmpl w:val="DCF4F8A0"/>
@@ -14413,7 +15348,7 @@
       </w:pPr>
     </w:lvl>
   </w:abstractNum>
-  <w:abstractNum w:abstractNumId="18" w15:restartNumberingAfterBreak="0">
+  <w:abstractNum w:abstractNumId="22" w15:restartNumberingAfterBreak="0">
     <w:nsid w:val="48BA56F2"/>
     <w:multiLevelType w:val="hybridMultilevel"/>
     <w:tmpl w:val="78A0FEB2"/>
@@ -14545,7 +15480,7 @@
       </w:rPr>
     </w:lvl>
   </w:abstractNum>
-  <w:abstractNum w:abstractNumId="19" w15:restartNumberingAfterBreak="0">
+  <w:abstractNum w:abstractNumId="23" w15:restartNumberingAfterBreak="0">
     <w:nsid w:val="4B460168"/>
     <w:multiLevelType w:val="hybridMultilevel"/>
     <w:tmpl w:val="302451B6"/>
@@ -14659,7 +15594,7 @@
       </w:rPr>
     </w:lvl>
   </w:abstractNum>
-  <w:abstractNum w:abstractNumId="20" w15:restartNumberingAfterBreak="0">
+  <w:abstractNum w:abstractNumId="24" w15:restartNumberingAfterBreak="0">
     <w:nsid w:val="52E27BDE"/>
     <w:multiLevelType w:val="hybridMultilevel"/>
     <w:tmpl w:val="DCF4F8A0"/>
@@ -14745,7 +15680,265 @@
       </w:pPr>
     </w:lvl>
   </w:abstractNum>
-  <w:abstractNum w:abstractNumId="21" w15:restartNumberingAfterBreak="0">
+  <w:abstractNum w:abstractNumId="25" w15:restartNumberingAfterBreak="0">
+    <w:nsid w:val="55CC4CD6"/>
+    <w:multiLevelType w:val="hybridMultilevel"/>
+    <w:tmpl w:val="569C13AA"/>
+    <w:lvl w:ilvl="0" w:tplc="FFFFFFFF">
+      <w:start w:val="1"/>
+      <w:numFmt w:val="decimal"/>
+      <w:lvlText w:val="%1."/>
+      <w:lvlJc w:val="left"/>
+      <w:pPr>
+        <w:ind w:left="720" w:hanging="360"/>
+      </w:pPr>
+    </w:lvl>
+    <w:lvl w:ilvl="1" w:tplc="FFFFFFFF" w:tentative="1">
+      <w:start w:val="1"/>
+      <w:numFmt w:val="lowerLetter"/>
+      <w:lvlText w:val="%2."/>
+      <w:lvlJc w:val="left"/>
+      <w:pPr>
+        <w:ind w:left="1440" w:hanging="360"/>
+      </w:pPr>
+    </w:lvl>
+    <w:lvl w:ilvl="2" w:tplc="FFFFFFFF" w:tentative="1">
+      <w:start w:val="1"/>
+      <w:numFmt w:val="lowerRoman"/>
+      <w:lvlText w:val="%3."/>
+      <w:lvlJc w:val="right"/>
+      <w:pPr>
+        <w:ind w:left="2160" w:hanging="180"/>
+      </w:pPr>
+    </w:lvl>
+    <w:lvl w:ilvl="3" w:tplc="FFFFFFFF" w:tentative="1">
+      <w:start w:val="1"/>
+      <w:numFmt w:val="decimal"/>
+      <w:lvlText w:val="%4."/>
+      <w:lvlJc w:val="left"/>
+      <w:pPr>
+        <w:ind w:left="2880" w:hanging="360"/>
+      </w:pPr>
+    </w:lvl>
+    <w:lvl w:ilvl="4" w:tplc="FFFFFFFF" w:tentative="1">
+      <w:start w:val="1"/>
+      <w:numFmt w:val="lowerLetter"/>
+      <w:lvlText w:val="%5."/>
+      <w:lvlJc w:val="left"/>
+      <w:pPr>
+        <w:ind w:left="3600" w:hanging="360"/>
+      </w:pPr>
+    </w:lvl>
+    <w:lvl w:ilvl="5" w:tplc="FFFFFFFF" w:tentative="1">
+      <w:start w:val="1"/>
+      <w:numFmt w:val="lowerRoman"/>
+      <w:lvlText w:val="%6."/>
+      <w:lvlJc w:val="right"/>
+      <w:pPr>
+        <w:ind w:left="4320" w:hanging="180"/>
+      </w:pPr>
+    </w:lvl>
+    <w:lvl w:ilvl="6" w:tplc="FFFFFFFF" w:tentative="1">
+      <w:start w:val="1"/>
+      <w:numFmt w:val="decimal"/>
+      <w:lvlText w:val="%7."/>
+      <w:lvlJc w:val="left"/>
+      <w:pPr>
+        <w:ind w:left="5040" w:hanging="360"/>
+      </w:pPr>
+    </w:lvl>
+    <w:lvl w:ilvl="7" w:tplc="FFFFFFFF" w:tentative="1">
+      <w:start w:val="1"/>
+      <w:numFmt w:val="lowerLetter"/>
+      <w:lvlText w:val="%8."/>
+      <w:lvlJc w:val="left"/>
+      <w:pPr>
+        <w:ind w:left="5760" w:hanging="360"/>
+      </w:pPr>
+    </w:lvl>
+    <w:lvl w:ilvl="8" w:tplc="FFFFFFFF" w:tentative="1">
+      <w:start w:val="1"/>
+      <w:numFmt w:val="lowerRoman"/>
+      <w:lvlText w:val="%9."/>
+      <w:lvlJc w:val="right"/>
+      <w:pPr>
+        <w:ind w:left="6480" w:hanging="180"/>
+      </w:pPr>
+    </w:lvl>
+  </w:abstractNum>
+  <w:abstractNum w:abstractNumId="26" w15:restartNumberingAfterBreak="0">
+    <w:nsid w:val="572867BE"/>
+    <w:multiLevelType w:val="hybridMultilevel"/>
+    <w:tmpl w:val="90129BE6"/>
+    <w:lvl w:ilvl="0" w:tplc="FFFFFFFF">
+      <w:start w:val="1"/>
+      <w:numFmt w:val="decimal"/>
+      <w:lvlText w:val="%1."/>
+      <w:lvlJc w:val="left"/>
+      <w:pPr>
+        <w:ind w:left="720" w:hanging="360"/>
+      </w:pPr>
+    </w:lvl>
+    <w:lvl w:ilvl="1" w:tplc="FFFFFFFF" w:tentative="1">
+      <w:start w:val="1"/>
+      <w:numFmt w:val="lowerLetter"/>
+      <w:lvlText w:val="%2."/>
+      <w:lvlJc w:val="left"/>
+      <w:pPr>
+        <w:ind w:left="1440" w:hanging="360"/>
+      </w:pPr>
+    </w:lvl>
+    <w:lvl w:ilvl="2" w:tplc="FFFFFFFF" w:tentative="1">
+      <w:start w:val="1"/>
+      <w:numFmt w:val="lowerRoman"/>
+      <w:lvlText w:val="%3."/>
+      <w:lvlJc w:val="right"/>
+      <w:pPr>
+        <w:ind w:left="2160" w:hanging="180"/>
+      </w:pPr>
+    </w:lvl>
+    <w:lvl w:ilvl="3" w:tplc="FFFFFFFF" w:tentative="1">
+      <w:start w:val="1"/>
+      <w:numFmt w:val="decimal"/>
+      <w:lvlText w:val="%4."/>
+      <w:lvlJc w:val="left"/>
+      <w:pPr>
+        <w:ind w:left="2880" w:hanging="360"/>
+      </w:pPr>
+    </w:lvl>
+    <w:lvl w:ilvl="4" w:tplc="FFFFFFFF" w:tentative="1">
+      <w:start w:val="1"/>
+      <w:numFmt w:val="lowerLetter"/>
+      <w:lvlText w:val="%5."/>
+      <w:lvlJc w:val="left"/>
+      <w:pPr>
+        <w:ind w:left="3600" w:hanging="360"/>
+      </w:pPr>
+    </w:lvl>
+    <w:lvl w:ilvl="5" w:tplc="FFFFFFFF" w:tentative="1">
+      <w:start w:val="1"/>
+      <w:numFmt w:val="lowerRoman"/>
+      <w:lvlText w:val="%6."/>
+      <w:lvlJc w:val="right"/>
+      <w:pPr>
+        <w:ind w:left="4320" w:hanging="180"/>
+      </w:pPr>
+    </w:lvl>
+    <w:lvl w:ilvl="6" w:tplc="FFFFFFFF" w:tentative="1">
+      <w:start w:val="1"/>
+      <w:numFmt w:val="decimal"/>
+      <w:lvlText w:val="%7."/>
+      <w:lvlJc w:val="left"/>
+      <w:pPr>
+        <w:ind w:left="5040" w:hanging="360"/>
+      </w:pPr>
+    </w:lvl>
+    <w:lvl w:ilvl="7" w:tplc="FFFFFFFF" w:tentative="1">
+      <w:start w:val="1"/>
+      <w:numFmt w:val="lowerLetter"/>
+      <w:lvlText w:val="%8."/>
+      <w:lvlJc w:val="left"/>
+      <w:pPr>
+        <w:ind w:left="5760" w:hanging="360"/>
+      </w:pPr>
+    </w:lvl>
+    <w:lvl w:ilvl="8" w:tplc="FFFFFFFF" w:tentative="1">
+      <w:start w:val="1"/>
+      <w:numFmt w:val="lowerRoman"/>
+      <w:lvlText w:val="%9."/>
+      <w:lvlJc w:val="right"/>
+      <w:pPr>
+        <w:ind w:left="6480" w:hanging="180"/>
+      </w:pPr>
+    </w:lvl>
+  </w:abstractNum>
+  <w:abstractNum w:abstractNumId="27" w15:restartNumberingAfterBreak="0">
+    <w:nsid w:val="5FE63D99"/>
+    <w:multiLevelType w:val="hybridMultilevel"/>
+    <w:tmpl w:val="90129BE6"/>
+    <w:lvl w:ilvl="0" w:tplc="0409000F">
+      <w:start w:val="1"/>
+      <w:numFmt w:val="decimal"/>
+      <w:lvlText w:val="%1."/>
+      <w:lvlJc w:val="left"/>
+      <w:pPr>
+        <w:ind w:left="720" w:hanging="360"/>
+      </w:pPr>
+    </w:lvl>
+    <w:lvl w:ilvl="1" w:tplc="04090019" w:tentative="1">
+      <w:start w:val="1"/>
+      <w:numFmt w:val="lowerLetter"/>
+      <w:lvlText w:val="%2."/>
+      <w:lvlJc w:val="left"/>
+      <w:pPr>
+        <w:ind w:left="1440" w:hanging="360"/>
+      </w:pPr>
+    </w:lvl>
+    <w:lvl w:ilvl="2" w:tplc="0409001B" w:tentative="1">
+      <w:start w:val="1"/>
+      <w:numFmt w:val="lowerRoman"/>
+      <w:lvlText w:val="%3."/>
+      <w:lvlJc w:val="right"/>
+      <w:pPr>
+        <w:ind w:left="2160" w:hanging="180"/>
+      </w:pPr>
+    </w:lvl>
+    <w:lvl w:ilvl="3" w:tplc="0409000F" w:tentative="1">
+      <w:start w:val="1"/>
+      <w:numFmt w:val="decimal"/>
+      <w:lvlText w:val="%4."/>
+      <w:lvlJc w:val="left"/>
+      <w:pPr>
+        <w:ind w:left="2880" w:hanging="360"/>
+      </w:pPr>
+    </w:lvl>
+    <w:lvl w:ilvl="4" w:tplc="04090019" w:tentative="1">
+      <w:start w:val="1"/>
+      <w:numFmt w:val="lowerLetter"/>
+      <w:lvlText w:val="%5."/>
+      <w:lvlJc w:val="left"/>
+      <w:pPr>
+        <w:ind w:left="3600" w:hanging="360"/>
+      </w:pPr>
+    </w:lvl>
+    <w:lvl w:ilvl="5" w:tplc="0409001B" w:tentative="1">
+      <w:start w:val="1"/>
+      <w:numFmt w:val="lowerRoman"/>
+      <w:lvlText w:val="%6."/>
+      <w:lvlJc w:val="right"/>
+      <w:pPr>
+        <w:ind w:left="4320" w:hanging="180"/>
+      </w:pPr>
+    </w:lvl>
+    <w:lvl w:ilvl="6" w:tplc="0409000F" w:tentative="1">
+      <w:start w:val="1"/>
+      <w:numFmt w:val="decimal"/>
+      <w:lvlText w:val="%7."/>
+      <w:lvlJc w:val="left"/>
+      <w:pPr>
+        <w:ind w:left="5040" w:hanging="360"/>
+      </w:pPr>
+    </w:lvl>
+    <w:lvl w:ilvl="7" w:tplc="04090019" w:tentative="1">
+      <w:start w:val="1"/>
+      <w:numFmt w:val="lowerLetter"/>
+      <w:lvlText w:val="%8."/>
+      <w:lvlJc w:val="left"/>
+      <w:pPr>
+        <w:ind w:left="5760" w:hanging="360"/>
+      </w:pPr>
+    </w:lvl>
+    <w:lvl w:ilvl="8" w:tplc="0409001B" w:tentative="1">
+      <w:start w:val="1"/>
+      <w:numFmt w:val="lowerRoman"/>
+      <w:lvlText w:val="%9."/>
+      <w:lvlJc w:val="right"/>
+      <w:pPr>
+        <w:ind w:left="6480" w:hanging="180"/>
+      </w:pPr>
+    </w:lvl>
+  </w:abstractNum>
+  <w:abstractNum w:abstractNumId="28" w15:restartNumberingAfterBreak="0">
     <w:nsid w:val="65245435"/>
     <w:multiLevelType w:val="hybridMultilevel"/>
     <w:tmpl w:val="67F6BD5A"/>
@@ -14867,7 +16060,7 @@
       </w:rPr>
     </w:lvl>
   </w:abstractNum>
-  <w:abstractNum w:abstractNumId="22" w15:restartNumberingAfterBreak="0">
+  <w:abstractNum w:abstractNumId="29" w15:restartNumberingAfterBreak="0">
     <w:nsid w:val="68D327E0"/>
     <w:multiLevelType w:val="hybridMultilevel"/>
     <w:tmpl w:val="66AA1D3C"/>
@@ -14957,7 +16150,93 @@
       </w:pPr>
     </w:lvl>
   </w:abstractNum>
-  <w:abstractNum w:abstractNumId="23" w15:restartNumberingAfterBreak="0">
+  <w:abstractNum w:abstractNumId="30" w15:restartNumberingAfterBreak="0">
+    <w:nsid w:val="6AB50000"/>
+    <w:multiLevelType w:val="hybridMultilevel"/>
+    <w:tmpl w:val="5B82E648"/>
+    <w:lvl w:ilvl="0" w:tplc="FFFFFFFF">
+      <w:start w:val="1"/>
+      <w:numFmt w:val="decimal"/>
+      <w:lvlText w:val="%1."/>
+      <w:lvlJc w:val="left"/>
+      <w:pPr>
+        <w:ind w:left="720" w:hanging="360"/>
+      </w:pPr>
+    </w:lvl>
+    <w:lvl w:ilvl="1" w:tplc="FFFFFFFF" w:tentative="1">
+      <w:start w:val="1"/>
+      <w:numFmt w:val="lowerLetter"/>
+      <w:lvlText w:val="%2."/>
+      <w:lvlJc w:val="left"/>
+      <w:pPr>
+        <w:ind w:left="1440" w:hanging="360"/>
+      </w:pPr>
+    </w:lvl>
+    <w:lvl w:ilvl="2" w:tplc="FFFFFFFF" w:tentative="1">
+      <w:start w:val="1"/>
+      <w:numFmt w:val="lowerRoman"/>
+      <w:lvlText w:val="%3."/>
+      <w:lvlJc w:val="right"/>
+      <w:pPr>
+        <w:ind w:left="2160" w:hanging="180"/>
+      </w:pPr>
+    </w:lvl>
+    <w:lvl w:ilvl="3" w:tplc="FFFFFFFF" w:tentative="1">
+      <w:start w:val="1"/>
+      <w:numFmt w:val="decimal"/>
+      <w:lvlText w:val="%4."/>
+      <w:lvlJc w:val="left"/>
+      <w:pPr>
+        <w:ind w:left="2880" w:hanging="360"/>
+      </w:pPr>
+    </w:lvl>
+    <w:lvl w:ilvl="4" w:tplc="FFFFFFFF" w:tentative="1">
+      <w:start w:val="1"/>
+      <w:numFmt w:val="lowerLetter"/>
+      <w:lvlText w:val="%5."/>
+      <w:lvlJc w:val="left"/>
+      <w:pPr>
+        <w:ind w:left="3600" w:hanging="360"/>
+      </w:pPr>
+    </w:lvl>
+    <w:lvl w:ilvl="5" w:tplc="FFFFFFFF" w:tentative="1">
+      <w:start w:val="1"/>
+      <w:numFmt w:val="lowerRoman"/>
+      <w:lvlText w:val="%6."/>
+      <w:lvlJc w:val="right"/>
+      <w:pPr>
+        <w:ind w:left="4320" w:hanging="180"/>
+      </w:pPr>
+    </w:lvl>
+    <w:lvl w:ilvl="6" w:tplc="FFFFFFFF" w:tentative="1">
+      <w:start w:val="1"/>
+      <w:numFmt w:val="decimal"/>
+      <w:lvlText w:val="%7."/>
+      <w:lvlJc w:val="left"/>
+      <w:pPr>
+        <w:ind w:left="5040" w:hanging="360"/>
+      </w:pPr>
+    </w:lvl>
+    <w:lvl w:ilvl="7" w:tplc="FFFFFFFF" w:tentative="1">
+      <w:start w:val="1"/>
+      <w:numFmt w:val="lowerLetter"/>
+      <w:lvlText w:val="%8."/>
+      <w:lvlJc w:val="left"/>
+      <w:pPr>
+        <w:ind w:left="5760" w:hanging="360"/>
+      </w:pPr>
+    </w:lvl>
+    <w:lvl w:ilvl="8" w:tplc="FFFFFFFF" w:tentative="1">
+      <w:start w:val="1"/>
+      <w:numFmt w:val="lowerRoman"/>
+      <w:lvlText w:val="%9."/>
+      <w:lvlJc w:val="right"/>
+      <w:pPr>
+        <w:ind w:left="6480" w:hanging="180"/>
+      </w:pPr>
+    </w:lvl>
+  </w:abstractNum>
+  <w:abstractNum w:abstractNumId="31" w15:restartNumberingAfterBreak="0">
     <w:nsid w:val="715E7E07"/>
     <w:multiLevelType w:val="hybridMultilevel"/>
     <w:tmpl w:val="69FC6998"/>
@@ -15079,7 +16358,179 @@
       </w:rPr>
     </w:lvl>
   </w:abstractNum>
-  <w:abstractNum w:abstractNumId="24" w15:restartNumberingAfterBreak="0">
+  <w:abstractNum w:abstractNumId="32" w15:restartNumberingAfterBreak="0">
+    <w:nsid w:val="71AB0927"/>
+    <w:multiLevelType w:val="hybridMultilevel"/>
+    <w:tmpl w:val="8D1007BA"/>
+    <w:lvl w:ilvl="0" w:tplc="FFFFFFFF">
+      <w:start w:val="1"/>
+      <w:numFmt w:val="decimal"/>
+      <w:lvlText w:val="%1."/>
+      <w:lvlJc w:val="left"/>
+      <w:pPr>
+        <w:ind w:left="720" w:hanging="360"/>
+      </w:pPr>
+    </w:lvl>
+    <w:lvl w:ilvl="1" w:tplc="FFFFFFFF" w:tentative="1">
+      <w:start w:val="1"/>
+      <w:numFmt w:val="lowerLetter"/>
+      <w:lvlText w:val="%2."/>
+      <w:lvlJc w:val="left"/>
+      <w:pPr>
+        <w:ind w:left="1440" w:hanging="360"/>
+      </w:pPr>
+    </w:lvl>
+    <w:lvl w:ilvl="2" w:tplc="FFFFFFFF" w:tentative="1">
+      <w:start w:val="1"/>
+      <w:numFmt w:val="lowerRoman"/>
+      <w:lvlText w:val="%3."/>
+      <w:lvlJc w:val="right"/>
+      <w:pPr>
+        <w:ind w:left="2160" w:hanging="180"/>
+      </w:pPr>
+    </w:lvl>
+    <w:lvl w:ilvl="3" w:tplc="FFFFFFFF" w:tentative="1">
+      <w:start w:val="1"/>
+      <w:numFmt w:val="decimal"/>
+      <w:lvlText w:val="%4."/>
+      <w:lvlJc w:val="left"/>
+      <w:pPr>
+        <w:ind w:left="2880" w:hanging="360"/>
+      </w:pPr>
+    </w:lvl>
+    <w:lvl w:ilvl="4" w:tplc="FFFFFFFF" w:tentative="1">
+      <w:start w:val="1"/>
+      <w:numFmt w:val="lowerLetter"/>
+      <w:lvlText w:val="%5."/>
+      <w:lvlJc w:val="left"/>
+      <w:pPr>
+        <w:ind w:left="3600" w:hanging="360"/>
+      </w:pPr>
+    </w:lvl>
+    <w:lvl w:ilvl="5" w:tplc="FFFFFFFF" w:tentative="1">
+      <w:start w:val="1"/>
+      <w:numFmt w:val="lowerRoman"/>
+      <w:lvlText w:val="%6."/>
+      <w:lvlJc w:val="right"/>
+      <w:pPr>
+        <w:ind w:left="4320" w:hanging="180"/>
+      </w:pPr>
+    </w:lvl>
+    <w:lvl w:ilvl="6" w:tplc="FFFFFFFF" w:tentative="1">
+      <w:start w:val="1"/>
+      <w:numFmt w:val="decimal"/>
+      <w:lvlText w:val="%7."/>
+      <w:lvlJc w:val="left"/>
+      <w:pPr>
+        <w:ind w:left="5040" w:hanging="360"/>
+      </w:pPr>
+    </w:lvl>
+    <w:lvl w:ilvl="7" w:tplc="FFFFFFFF" w:tentative="1">
+      <w:start w:val="1"/>
+      <w:numFmt w:val="lowerLetter"/>
+      <w:lvlText w:val="%8."/>
+      <w:lvlJc w:val="left"/>
+      <w:pPr>
+        <w:ind w:left="5760" w:hanging="360"/>
+      </w:pPr>
+    </w:lvl>
+    <w:lvl w:ilvl="8" w:tplc="FFFFFFFF" w:tentative="1">
+      <w:start w:val="1"/>
+      <w:numFmt w:val="lowerRoman"/>
+      <w:lvlText w:val="%9."/>
+      <w:lvlJc w:val="right"/>
+      <w:pPr>
+        <w:ind w:left="6480" w:hanging="180"/>
+      </w:pPr>
+    </w:lvl>
+  </w:abstractNum>
+  <w:abstractNum w:abstractNumId="33" w15:restartNumberingAfterBreak="0">
+    <w:nsid w:val="73BC3F20"/>
+    <w:multiLevelType w:val="hybridMultilevel"/>
+    <w:tmpl w:val="C8F2AA76"/>
+    <w:lvl w:ilvl="0" w:tplc="FFFFFFFF">
+      <w:start w:val="1"/>
+      <w:numFmt w:val="decimal"/>
+      <w:lvlText w:val="%1."/>
+      <w:lvlJc w:val="left"/>
+      <w:pPr>
+        <w:ind w:left="720" w:hanging="360"/>
+      </w:pPr>
+    </w:lvl>
+    <w:lvl w:ilvl="1" w:tplc="FFFFFFFF" w:tentative="1">
+      <w:start w:val="1"/>
+      <w:numFmt w:val="lowerLetter"/>
+      <w:lvlText w:val="%2."/>
+      <w:lvlJc w:val="left"/>
+      <w:pPr>
+        <w:ind w:left="1440" w:hanging="360"/>
+      </w:pPr>
+    </w:lvl>
+    <w:lvl w:ilvl="2" w:tplc="FFFFFFFF" w:tentative="1">
+      <w:start w:val="1"/>
+      <w:numFmt w:val="lowerRoman"/>
+      <w:lvlText w:val="%3."/>
+      <w:lvlJc w:val="right"/>
+      <w:pPr>
+        <w:ind w:left="2160" w:hanging="180"/>
+      </w:pPr>
+    </w:lvl>
+    <w:lvl w:ilvl="3" w:tplc="FFFFFFFF" w:tentative="1">
+      <w:start w:val="1"/>
+      <w:numFmt w:val="decimal"/>
+      <w:lvlText w:val="%4."/>
+      <w:lvlJc w:val="left"/>
+      <w:pPr>
+        <w:ind w:left="2880" w:hanging="360"/>
+      </w:pPr>
+    </w:lvl>
+    <w:lvl w:ilvl="4" w:tplc="FFFFFFFF" w:tentative="1">
+      <w:start w:val="1"/>
+      <w:numFmt w:val="lowerLetter"/>
+      <w:lvlText w:val="%5."/>
+      <w:lvlJc w:val="left"/>
+      <w:pPr>
+        <w:ind w:left="3600" w:hanging="360"/>
+      </w:pPr>
+    </w:lvl>
+    <w:lvl w:ilvl="5" w:tplc="FFFFFFFF" w:tentative="1">
+      <w:start w:val="1"/>
+      <w:numFmt w:val="lowerRoman"/>
+      <w:lvlText w:val="%6."/>
+      <w:lvlJc w:val="right"/>
+      <w:pPr>
+        <w:ind w:left="4320" w:hanging="180"/>
+      </w:pPr>
+    </w:lvl>
+    <w:lvl w:ilvl="6" w:tplc="FFFFFFFF" w:tentative="1">
+      <w:start w:val="1"/>
+      <w:numFmt w:val="decimal"/>
+      <w:lvlText w:val="%7."/>
+      <w:lvlJc w:val="left"/>
+      <w:pPr>
+        <w:ind w:left="5040" w:hanging="360"/>
+      </w:pPr>
+    </w:lvl>
+    <w:lvl w:ilvl="7" w:tplc="FFFFFFFF" w:tentative="1">
+      <w:start w:val="1"/>
+      <w:numFmt w:val="lowerLetter"/>
+      <w:lvlText w:val="%8."/>
+      <w:lvlJc w:val="left"/>
+      <w:pPr>
+        <w:ind w:left="5760" w:hanging="360"/>
+      </w:pPr>
+    </w:lvl>
+    <w:lvl w:ilvl="8" w:tplc="FFFFFFFF" w:tentative="1">
+      <w:start w:val="1"/>
+      <w:numFmt w:val="lowerRoman"/>
+      <w:lvlText w:val="%9."/>
+      <w:lvlJc w:val="right"/>
+      <w:pPr>
+        <w:ind w:left="6480" w:hanging="180"/>
+      </w:pPr>
+    </w:lvl>
+  </w:abstractNum>
+  <w:abstractNum w:abstractNumId="34" w15:restartNumberingAfterBreak="0">
     <w:nsid w:val="784A0AAE"/>
     <w:multiLevelType w:val="hybridMultilevel"/>
     <w:tmpl w:val="BA96918A"/>
@@ -15200,7 +16651,7 @@
       </w:rPr>
     </w:lvl>
   </w:abstractNum>
-  <w:abstractNum w:abstractNumId="25" w15:restartNumberingAfterBreak="0">
+  <w:abstractNum w:abstractNumId="35" w15:restartNumberingAfterBreak="0">
     <w:nsid w:val="7CBA4716"/>
     <w:multiLevelType w:val="hybridMultilevel"/>
     <w:tmpl w:val="B7605828"/>
@@ -15321,7 +16772,7 @@
       </w:rPr>
     </w:lvl>
   </w:abstractNum>
-  <w:abstractNum w:abstractNumId="26" w15:restartNumberingAfterBreak="0">
+  <w:abstractNum w:abstractNumId="36" w15:restartNumberingAfterBreak="0">
     <w:nsid w:val="7E0607B0"/>
     <w:multiLevelType w:val="hybridMultilevel"/>
     <w:tmpl w:val="A96ABB8C"/>
@@ -15443,7 +16894,7 @@
       </w:rPr>
     </w:lvl>
   </w:abstractNum>
-  <w:abstractNum w:abstractNumId="27" w15:restartNumberingAfterBreak="0">
+  <w:abstractNum w:abstractNumId="37" w15:restartNumberingAfterBreak="0">
     <w:nsid w:val="7FD317BC"/>
     <w:multiLevelType w:val="hybridMultilevel"/>
     <w:tmpl w:val="8A8EF9D4"/>
@@ -15542,87 +16993,117 @@
     </w:lvl>
   </w:abstractNum>
   <w:num w:numId="1">
+    <w:abstractNumId w:val="16"/>
+  </w:num>
+  <w:num w:numId="2">
+    <w:abstractNumId w:val="7"/>
+  </w:num>
+  <w:num w:numId="3">
+    <w:abstractNumId w:val="2"/>
+  </w:num>
+  <w:num w:numId="4">
+    <w:abstractNumId w:val="35"/>
+  </w:num>
+  <w:num w:numId="5">
+    <w:abstractNumId w:val="34"/>
+  </w:num>
+  <w:num w:numId="6">
+    <w:abstractNumId w:val="19"/>
+  </w:num>
+  <w:num w:numId="7">
+    <w:abstractNumId w:val="9"/>
+  </w:num>
+  <w:num w:numId="8">
+    <w:abstractNumId w:val="31"/>
+  </w:num>
+  <w:num w:numId="9">
+    <w:abstractNumId w:val="28"/>
+  </w:num>
+  <w:num w:numId="10">
     <w:abstractNumId w:val="13"/>
   </w:num>
-  <w:num w:numId="2">
+  <w:num w:numId="11">
+    <w:abstractNumId w:val="3"/>
+  </w:num>
+  <w:num w:numId="12">
+    <w:abstractNumId w:val="29"/>
+  </w:num>
+  <w:num w:numId="13">
+    <w:abstractNumId w:val="1"/>
+  </w:num>
+  <w:num w:numId="14">
+    <w:abstractNumId w:val="5"/>
+  </w:num>
+  <w:num w:numId="15">
+    <w:abstractNumId w:val="4"/>
+  </w:num>
+  <w:num w:numId="16">
+    <w:abstractNumId w:val="15"/>
+  </w:num>
+  <w:num w:numId="17">
+    <w:abstractNumId w:val="22"/>
+  </w:num>
+  <w:num w:numId="18">
+    <w:abstractNumId w:val="12"/>
+  </w:num>
+  <w:num w:numId="19">
     <w:abstractNumId w:val="6"/>
   </w:num>
-  <w:num w:numId="3">
-    <w:abstractNumId w:val="1"/>
+  <w:num w:numId="20">
+    <w:abstractNumId w:val="20"/>
   </w:num>
-  <w:num w:numId="4">
+  <w:num w:numId="21">
+    <w:abstractNumId w:val="23"/>
+  </w:num>
+  <w:num w:numId="22">
+    <w:abstractNumId w:val="10"/>
+  </w:num>
+  <w:num w:numId="23">
+    <w:abstractNumId w:val="37"/>
+  </w:num>
+  <w:num w:numId="24">
+    <w:abstractNumId w:val="14"/>
+  </w:num>
+  <w:num w:numId="25">
+    <w:abstractNumId w:val="17"/>
+  </w:num>
+  <w:num w:numId="26">
+    <w:abstractNumId w:val="24"/>
+  </w:num>
+  <w:num w:numId="27">
+    <w:abstractNumId w:val="21"/>
+  </w:num>
+  <w:num w:numId="28">
+    <w:abstractNumId w:val="36"/>
+  </w:num>
+  <w:num w:numId="29">
+    <w:abstractNumId w:val="27"/>
+  </w:num>
+  <w:num w:numId="30">
+    <w:abstractNumId w:val="18"/>
+  </w:num>
+  <w:num w:numId="31">
+    <w:abstractNumId w:val="8"/>
+  </w:num>
+  <w:num w:numId="32">
+    <w:abstractNumId w:val="11"/>
+  </w:num>
+  <w:num w:numId="33">
+    <w:abstractNumId w:val="30"/>
+  </w:num>
+  <w:num w:numId="34">
+    <w:abstractNumId w:val="32"/>
+  </w:num>
+  <w:num w:numId="35">
+    <w:abstractNumId w:val="33"/>
+  </w:num>
+  <w:num w:numId="36">
+    <w:abstractNumId w:val="0"/>
+  </w:num>
+  <w:num w:numId="37">
     <w:abstractNumId w:val="25"/>
   </w:num>
-  <w:num w:numId="5">
-    <w:abstractNumId w:val="24"/>
-  </w:num>
-  <w:num w:numId="6">
-    <w:abstractNumId w:val="15"/>
-  </w:num>
-  <w:num w:numId="7">
-    <w:abstractNumId w:val="7"/>
-  </w:num>
-  <w:num w:numId="8">
-    <w:abstractNumId w:val="23"/>
-  </w:num>
-  <w:num w:numId="9">
-    <w:abstractNumId w:val="21"/>
-  </w:num>
-  <w:num w:numId="10">
-    <w:abstractNumId w:val="10"/>
-  </w:num>
-  <w:num w:numId="11">
-    <w:abstractNumId w:val="2"/>
-  </w:num>
-  <w:num w:numId="12">
-    <w:abstractNumId w:val="22"/>
-  </w:num>
-  <w:num w:numId="13">
-    <w:abstractNumId w:val="0"/>
-  </w:num>
-  <w:num w:numId="14">
-    <w:abstractNumId w:val="4"/>
-  </w:num>
-  <w:num w:numId="15">
-    <w:abstractNumId w:val="3"/>
-  </w:num>
-  <w:num w:numId="16">
-    <w:abstractNumId w:val="12"/>
-  </w:num>
-  <w:num w:numId="17">
-    <w:abstractNumId w:val="18"/>
-  </w:num>
-  <w:num w:numId="18">
-    <w:abstractNumId w:val="9"/>
-  </w:num>
-  <w:num w:numId="19">
-    <w:abstractNumId w:val="5"/>
-  </w:num>
-  <w:num w:numId="20">
-    <w:abstractNumId w:val="16"/>
-  </w:num>
-  <w:num w:numId="21">
-    <w:abstractNumId w:val="19"/>
-  </w:num>
-  <w:num w:numId="22">
-    <w:abstractNumId w:val="8"/>
-  </w:num>
-  <w:num w:numId="23">
-    <w:abstractNumId w:val="27"/>
-  </w:num>
-  <w:num w:numId="24">
-    <w:abstractNumId w:val="11"/>
-  </w:num>
-  <w:num w:numId="25">
-    <w:abstractNumId w:val="14"/>
-  </w:num>
-  <w:num w:numId="26">
-    <w:abstractNumId w:val="20"/>
-  </w:num>
-  <w:num w:numId="27">
-    <w:abstractNumId w:val="17"/>
-  </w:num>
-  <w:num w:numId="28">
+  <w:num w:numId="38">
     <w:abstractNumId w:val="26"/>
   </w:num>
 </w:numbering>
@@ -16407,6 +17888,22 @@
       <w:lang w:val="en-US"/>
     </w:rPr>
   </w:style>
+  <w:style w:type="paragraph" w:customStyle="1" w:styleId="p2">
+    <w:name w:val="p2"/>
+    <w:basedOn w:val="Normal"/>
+    <w:rsid w:val="00C95DAA"/>
+    <w:pPr>
+      <w:widowControl/>
+      <w:autoSpaceDE/>
+      <w:autoSpaceDN/>
+      <w:spacing w:before="100" w:beforeAutospacing="1" w:after="100" w:afterAutospacing="1"/>
+    </w:pPr>
+    <w:rPr>
+      <w:sz w:val="24"/>
+      <w:szCs w:val="24"/>
+      <w:lang w:val="en-US"/>
+    </w:rPr>
+  </w:style>
 </w:styles>
 </file>
 

</xml_diff>

<commit_message>
Improve assessment materials and RPD export formatting
</commit_message>
<xml_diff>
--- a/storage/app/templates/rpd/science.docx
+++ b/storage/app/templates/rpd/science.docx
@@ -3933,7 +3933,7 @@
     <w:tbl>
       <w:tblPr>
         <w:tblStyle w:val="TableNormal1"/>
-        <w:tblW w:w="9605" w:type="dxa"/>
+        <w:tblW w:w="5000" w:type="pct"/>
         <w:jc w:val="center"/>
         <w:tblBorders>
           <w:top w:val="single" w:sz="6" w:space="0" w:color="000000"/>
@@ -3947,24 +3947,24 @@
         <w:tblLook w:val="01E0" w:firstRow="1" w:lastRow="1" w:firstColumn="1" w:lastColumn="1" w:noHBand="0" w:noVBand="0"/>
       </w:tblPr>
       <w:tblGrid>
-        <w:gridCol w:w="695"/>
-        <w:gridCol w:w="4267"/>
-        <w:gridCol w:w="850"/>
-        <w:gridCol w:w="992"/>
-        <w:gridCol w:w="1418"/>
-        <w:gridCol w:w="1383"/>
+        <w:gridCol w:w="544"/>
+        <w:gridCol w:w="4277"/>
+        <w:gridCol w:w="681"/>
+        <w:gridCol w:w="827"/>
+        <w:gridCol w:w="964"/>
+        <w:gridCol w:w="2040"/>
       </w:tblGrid>
       <w:tr>
         <w:trPr>
+          <w:cantSplit/>
           <w:trHeight w:val="368"/>
           <w:tblHeader/>
           <w:jc w:val="center"/>
         </w:trPr>
         <w:tc>
           <w:tcPr>
-            <w:tcW w:w="695" w:type="dxa"/>
+            <w:tcW w:w="544" w:type="dxa"/>
             <w:vMerge w:val="restart"/>
-            <w:vAlign w:val="center"/>
           </w:tcPr>
           <w:p>
             <w:pPr>
@@ -4021,9 +4021,8 @@
         </w:tc>
         <w:tc>
           <w:tcPr>
-            <w:tcW w:w="4267" w:type="dxa"/>
+            <w:tcW w:w="4277" w:type="dxa"/>
             <w:vMerge w:val="restart"/>
-            <w:vAlign w:val="center"/>
           </w:tcPr>
           <w:p>
             <w:pPr>
@@ -4106,9 +4105,8 @@
         </w:tc>
         <w:tc>
           <w:tcPr>
-            <w:tcW w:w="850" w:type="dxa"/>
+            <w:tcW w:w="681" w:type="dxa"/>
             <w:vMerge w:val="restart"/>
-            <w:vAlign w:val="center"/>
           </w:tcPr>
           <w:p>
             <w:pPr>
@@ -4131,9 +4129,8 @@
         </w:tc>
         <w:tc>
           <w:tcPr>
-            <w:tcW w:w="3793" w:type="dxa"/>
+            <w:tcW w:w="3831" w:type="dxa"/>
             <w:gridSpan w:val="3"/>
-            <w:vAlign w:val="center"/>
           </w:tcPr>
           <w:p>
             <w:pPr>
@@ -4187,18 +4184,18 @@
       </w:tr>
       <w:tr>
         <w:trPr>
+          <w:cantSplit/>
           <w:trHeight w:val="468"/>
           <w:tblHeader/>
           <w:jc w:val="center"/>
         </w:trPr>
         <w:tc>
           <w:tcPr>
-            <w:tcW w:w="695" w:type="dxa"/>
+            <w:tcW w:w="544" w:type="dxa"/>
             <w:vMerge/>
             <w:tcBorders>
               <w:top w:val="nil"/>
             </w:tcBorders>
-            <w:vAlign w:val="center"/>
           </w:tcPr>
           <w:p>
             <w:pPr>
@@ -4212,12 +4209,11 @@
         </w:tc>
         <w:tc>
           <w:tcPr>
-            <w:tcW w:w="4267" w:type="dxa"/>
+            <w:tcW w:w="4277" w:type="dxa"/>
             <w:vMerge/>
             <w:tcBorders>
               <w:top w:val="nil"/>
             </w:tcBorders>
-            <w:vAlign w:val="center"/>
           </w:tcPr>
           <w:p>
             <w:pPr>
@@ -4231,12 +4227,11 @@
         </w:tc>
         <w:tc>
           <w:tcPr>
-            <w:tcW w:w="850" w:type="dxa"/>
+            <w:tcW w:w="681" w:type="dxa"/>
             <w:vMerge/>
             <w:tcBorders>
               <w:top w:val="nil"/>
             </w:tcBorders>
-            <w:vAlign w:val="center"/>
           </w:tcPr>
           <w:p>
             <w:pPr>
@@ -4250,8 +4245,7 @@
         </w:tc>
         <w:tc>
           <w:tcPr>
-            <w:tcW w:w="992" w:type="dxa"/>
-            <w:vAlign w:val="center"/>
+            <w:tcW w:w="827" w:type="dxa"/>
           </w:tcPr>
           <w:p>
             <w:pPr>
@@ -4274,8 +4268,7 @@
         </w:tc>
         <w:tc>
           <w:tcPr>
-            <w:tcW w:w="1418" w:type="dxa"/>
-            <w:vAlign w:val="center"/>
+            <w:tcW w:w="964" w:type="dxa"/>
           </w:tcPr>
           <w:p>
             <w:pPr>
@@ -4298,8 +4291,7 @@
         </w:tc>
         <w:tc>
           <w:tcPr>
-            <w:tcW w:w="1383" w:type="dxa"/>
-            <w:vAlign w:val="center"/>
+            <w:tcW w:w="2040" w:type="dxa"/>
           </w:tcPr>
           <w:p>
             <w:pPr>
@@ -4339,12 +4331,14 @@
       </w:tr>
       <w:tr>
         <w:trPr>
+          <w:cantSplit/>
           <w:trHeight w:val="508"/>
+          <w:tblHeader/>
           <w:jc w:val="center"/>
         </w:trPr>
         <w:tc>
           <w:tcPr>
-            <w:tcW w:w="695" w:type="dxa"/>
+            <w:tcW w:w="544" w:type="dxa"/>
           </w:tcPr>
           <w:p>
             <w:pPr>
@@ -4381,7 +4375,7 @@
         </w:tc>
         <w:tc>
           <w:tcPr>
-            <w:tcW w:w="4267" w:type="dxa"/>
+            <w:tcW w:w="4277" w:type="dxa"/>
           </w:tcPr>
           <w:p>
             <w:pPr>
@@ -4402,7 +4396,7 @@
         </w:tc>
         <w:tc>
           <w:tcPr>
-            <w:tcW w:w="850" w:type="dxa"/>
+            <w:tcW w:w="681" w:type="dxa"/>
           </w:tcPr>
           <w:p>
             <w:pPr>
@@ -4423,7 +4417,7 @@
         </w:tc>
         <w:tc>
           <w:tcPr>
-            <w:tcW w:w="992" w:type="dxa"/>
+            <w:tcW w:w="827" w:type="dxa"/>
           </w:tcPr>
           <w:p>
             <w:pPr>
@@ -4444,7 +4438,7 @@
         </w:tc>
         <w:tc>
           <w:tcPr>
-            <w:tcW w:w="1418" w:type="dxa"/>
+            <w:tcW w:w="964" w:type="dxa"/>
           </w:tcPr>
           <w:p>
             <w:pPr>
@@ -4465,7 +4459,7 @@
         </w:tc>
         <w:tc>
           <w:tcPr>
-            <w:tcW w:w="1383" w:type="dxa"/>
+            <w:tcW w:w="2040" w:type="dxa"/>
           </w:tcPr>
           <w:p>
             <w:pPr>
@@ -4487,46 +4481,43 @@
       </w:tr>
       <w:tr>
         <w:trPr>
+          <w:cantSplit/>
           <w:trHeight w:val="508"/>
+          <w:tblHeader/>
           <w:jc w:val="center"/>
         </w:trPr>
         <w:tc>
           <w:tcPr>
-            <w:tcW w:w="695" w:type="dxa"/>
+            <w:tcW w:w="544" w:type="dxa"/>
           </w:tcPr>
           <w:p>
             <w:pPr>
-              <w:pStyle w:val="TableParagraph"/>
-              <w:jc w:val="both"/>
+              <w:pStyle w:val="p1"/>
               <w:rPr>
-                <w:spacing w:val="-5"/>
-                <w:w w:val="105"/>
-                <w:sz w:val="24"/>
-                <w:szCs w:val="24"/>
+                <w:b/>
+                <w:bCs/>
               </w:rPr>
             </w:pPr>
           </w:p>
         </w:tc>
         <w:tc>
           <w:tcPr>
-            <w:tcW w:w="4267" w:type="dxa"/>
+            <w:tcW w:w="4277" w:type="dxa"/>
           </w:tcPr>
           <w:p>
             <w:pPr>
-              <w:pStyle w:val="TableParagraph"/>
-              <w:ind w:left="57" w:right="57"/>
-              <w:jc w:val="both"/>
+              <w:pStyle w:val="p1"/>
               <w:rPr>
                 <w:b/>
-                <w:sz w:val="24"/>
-                <w:szCs w:val="24"/>
+                <w:bCs/>
+                <w:lang w:val="ru-RU"/>
               </w:rPr>
             </w:pPr>
             <w:r>
               <w:rPr>
                 <w:b/>
-                <w:sz w:val="24"/>
-                <w:szCs w:val="24"/>
+                <w:bCs/>
+                <w:lang w:val="ru-RU"/>
               </w:rPr>
               <w:t>ИТОГО</w:t>
             </w:r>
@@ -4534,77 +4525,131 @@
         </w:tc>
         <w:tc>
           <w:tcPr>
-            <w:tcW w:w="850" w:type="dxa"/>
+            <w:tcW w:w="681" w:type="dxa"/>
           </w:tcPr>
           <w:p>
             <w:pPr>
-              <w:pStyle w:val="TableParagraph"/>
-              <w:jc w:val="center"/>
+              <w:pStyle w:val="p1"/>
               <w:rPr>
                 <w:b/>
-                <w:spacing w:val="-10"/>
-                <w:sz w:val="24"/>
-                <w:szCs w:val="24"/>
+                <w:bCs/>
               </w:rPr>
             </w:pPr>
+            <w:r>
+              <w:rPr>
+                <w:b/>
+                <w:bCs/>
+              </w:rPr>
+              <w:t>${</w:t>
+            </w:r>
+            <w:proofErr w:type="spellStart"/>
+            <w:r>
+              <w:rPr>
+                <w:b/>
+                <w:bCs/>
+              </w:rPr>
+              <w:t>curriculum_total_sum</w:t>
+            </w:r>
+            <w:proofErr w:type="spellEnd"/>
+            <w:r>
+              <w:rPr>
+                <w:b/>
+                <w:bCs/>
+              </w:rPr>
+              <w:t>}</w:t>
+            </w:r>
           </w:p>
         </w:tc>
         <w:tc>
           <w:tcPr>
-            <w:tcW w:w="992" w:type="dxa"/>
+            <w:tcW w:w="827" w:type="dxa"/>
           </w:tcPr>
           <w:p>
             <w:pPr>
-              <w:pStyle w:val="TableParagraph"/>
-              <w:jc w:val="center"/>
+              <w:pStyle w:val="p1"/>
               <w:rPr>
-                <w:sz w:val="24"/>
-                <w:szCs w:val="24"/>
+                <w:b/>
+                <w:bCs/>
               </w:rPr>
             </w:pPr>
+            <w:r>
+              <w:rPr>
+                <w:b/>
+                <w:bCs/>
+              </w:rPr>
+              <w:t>${</w:t>
+            </w:r>
+            <w:proofErr w:type="spellStart"/>
+            <w:r>
+              <w:rPr>
+                <w:b/>
+                <w:bCs/>
+              </w:rPr>
+              <w:t>curriculum_theory_sum</w:t>
+            </w:r>
+            <w:proofErr w:type="spellEnd"/>
+            <w:r>
+              <w:rPr>
+                <w:b/>
+                <w:bCs/>
+              </w:rPr>
+              <w:t>}</w:t>
+            </w:r>
           </w:p>
         </w:tc>
         <w:tc>
           <w:tcPr>
-            <w:tcW w:w="1418" w:type="dxa"/>
+            <w:tcW w:w="964" w:type="dxa"/>
           </w:tcPr>
           <w:p>
             <w:pPr>
-              <w:pStyle w:val="TableParagraph"/>
-              <w:jc w:val="center"/>
+              <w:pStyle w:val="p1"/>
               <w:rPr>
                 <w:b/>
-                <w:spacing w:val="-10"/>
-                <w:sz w:val="24"/>
-                <w:szCs w:val="24"/>
+                <w:bCs/>
               </w:rPr>
             </w:pPr>
+            <w:r>
+              <w:rPr>
+                <w:b/>
+                <w:bCs/>
+              </w:rPr>
+              <w:t>${</w:t>
+            </w:r>
+            <w:proofErr w:type="spellStart"/>
+            <w:r>
+              <w:rPr>
+                <w:b/>
+                <w:bCs/>
+              </w:rPr>
+              <w:t>curriculum_practice_sum</w:t>
+            </w:r>
+            <w:proofErr w:type="spellEnd"/>
+            <w:r>
+              <w:rPr>
+                <w:b/>
+                <w:bCs/>
+              </w:rPr>
+              <w:t>}</w:t>
+            </w:r>
           </w:p>
         </w:tc>
         <w:tc>
           <w:tcPr>
-            <w:tcW w:w="1383" w:type="dxa"/>
+            <w:tcW w:w="2040" w:type="dxa"/>
           </w:tcPr>
           <w:p>
             <w:pPr>
-              <w:pStyle w:val="TableParagraph"/>
-              <w:jc w:val="center"/>
+              <w:pStyle w:val="p1"/>
               <w:rPr>
                 <w:b/>
-                <w:spacing w:val="-2"/>
-                <w:sz w:val="24"/>
-                <w:szCs w:val="24"/>
+                <w:bCs/>
               </w:rPr>
             </w:pPr>
           </w:p>
         </w:tc>
       </w:tr>
     </w:tbl>
-    <w:p>
-      <w:r>
-        <w:br w:type="page"/>
-      </w:r>
-    </w:p>
     <w:p>
       <w:pPr>
         <w:pStyle w:val="Heading1"/>
@@ -4628,7 +4673,6 @@
           <w:sz w:val="28"/>
           <w:szCs w:val="28"/>
         </w:rPr>
-        <w:lastRenderedPageBreak/>
         <w:t>КАЛЕНДАРНЫЙ</w:t>
       </w:r>
       <w:r>
@@ -4663,18 +4707,6 @@
         </w:rPr>
         <w:t>ГРАФИК</w:t>
       </w:r>
-    </w:p>
-    <w:p>
-      <w:pPr>
-        <w:pStyle w:val="BodyText"/>
-        <w:spacing w:line="360" w:lineRule="auto"/>
-        <w:ind w:left="0" w:firstLine="0"/>
-        <w:jc w:val="both"/>
-        <w:rPr>
-          <w:b/>
-          <w:sz w:val="10"/>
-        </w:rPr>
-      </w:pPr>
     </w:p>
     <w:p>
       <w:pPr>
@@ -4721,8 +4753,6 @@
         <w:t>Т - теория, П - практика</w:t>
       </w:r>
     </w:p>
-    <w:p/>
-    <w:p/>
     <w:p>
       <w:pPr>
         <w:pStyle w:val="Heading1"/>
@@ -4791,17 +4821,18 @@
       <w:tblPr>
         <w:tblStyle w:val="TableGrid"/>
         <w:tblW w:w="0" w:type="auto"/>
+        <w:tblLayout w:type="fixed"/>
         <w:tblLook w:val="04A0" w:firstRow="1" w:lastRow="0" w:firstColumn="1" w:lastColumn="0" w:noHBand="0" w:noVBand="1"/>
       </w:tblPr>
       <w:tblGrid>
-        <w:gridCol w:w="1049"/>
-        <w:gridCol w:w="3292"/>
-        <w:gridCol w:w="4998"/>
+        <w:gridCol w:w="1129"/>
+        <w:gridCol w:w="2977"/>
+        <w:gridCol w:w="5233"/>
       </w:tblGrid>
       <w:tr>
         <w:tc>
           <w:tcPr>
-            <w:tcW w:w="1049" w:type="dxa"/>
+            <w:tcW w:w="1129" w:type="dxa"/>
           </w:tcPr>
           <w:p>
             <w:pPr>
@@ -4825,7 +4856,7 @@
         </w:tc>
         <w:tc>
           <w:tcPr>
-            <w:tcW w:w="3292" w:type="dxa"/>
+            <w:tcW w:w="2977" w:type="dxa"/>
           </w:tcPr>
           <w:p>
             <w:pPr>
@@ -4849,7 +4880,7 @@
         </w:tc>
         <w:tc>
           <w:tcPr>
-            <w:tcW w:w="4998" w:type="dxa"/>
+            <w:tcW w:w="5233" w:type="dxa"/>
           </w:tcPr>
           <w:p>
             <w:pPr>
@@ -4875,7 +4906,7 @@
       <w:tr>
         <w:tc>
           <w:tcPr>
-            <w:tcW w:w="1049" w:type="dxa"/>
+            <w:tcW w:w="1129" w:type="dxa"/>
           </w:tcPr>
           <w:p>
             <w:pPr>
@@ -4895,7 +4926,7 @@
         </w:tc>
         <w:tc>
           <w:tcPr>
-            <w:tcW w:w="3292" w:type="dxa"/>
+            <w:tcW w:w="2977" w:type="dxa"/>
           </w:tcPr>
           <w:p>
             <w:pPr>
@@ -4916,7 +4947,7 @@
         </w:tc>
         <w:tc>
           <w:tcPr>
-            <w:tcW w:w="4998" w:type="dxa"/>
+            <w:tcW w:w="5233" w:type="dxa"/>
           </w:tcPr>
           <w:p>
             <w:pPr>
@@ -5171,6 +5202,7 @@
           <w:sz w:val="28"/>
           <w:szCs w:val="28"/>
         </w:rPr>
+        <w:lastRenderedPageBreak/>
         <w:t>Осуществления мониторинга результатов педагогического труда.</w:t>
       </w:r>
     </w:p>
@@ -5209,15 +5241,7 @@
           <w:sz w:val="28"/>
           <w:szCs w:val="28"/>
         </w:rPr>
-        <w:t xml:space="preserve">Результаты процедур оценки результатов деятельности ДТ «Альтаир» обсуждаются на Ученом совете Университета и являются основанием для </w:t>
-      </w:r>
-      <w:r>
-        <w:rPr>
-          <w:sz w:val="28"/>
-          <w:szCs w:val="28"/>
-        </w:rPr>
-        <w:lastRenderedPageBreak/>
-        <w:t>принятия решений по коррекции текущей образовательной деятельности, по совершенствованию ДОПП и уточнению и/или разработке программы развития ДТ «Альтаир», а также служат основанием для принятия иных необходимых управленческих решений.</w:t>
+        <w:t>Результаты процедур оценки результатов деятельности ДТ «Альтаир» обсуждаются на Ученом совете Университета и являются основанием для принятия решений по коррекции текущей образовательной деятельности, по совершенствованию ДОПП и уточнению и/или разработке программы развития ДТ «Альтаир», а также служат основанием для принятия иных необходимых управленческих решений.</w:t>
       </w:r>
       <w:r>
         <w:rPr>
@@ -5664,7 +5688,16 @@
           <w:sz w:val="28"/>
           <w:szCs w:val="28"/>
         </w:rPr>
-        <w:t>Материально-техническая база программы реализуется на современной инфраструктуре технопарка, оснащённой передовым оборудованием для проведения образовательных и исследовательских работ. Образовательные пространства оборудованы инновационными техническими средствами, включая специализированные рабочие места и интерактивные комплексы, что обеспечивает высокое качество учебного процесса. Лабораторный комплекс располагает всем необходимым оборудованием для проведения практических занятий, включая современные измерительные приборы, аналитическую технику и специализированное лабораторное оснащение.</w:t>
+        <w:t xml:space="preserve">Материально-техническая база программы реализуется на современной инфраструктуре технопарка, оснащённой передовым оборудованием для проведения образовательных и исследовательских работ. Образовательные пространства оборудованы инновационными техническими средствами, включая специализированные рабочие места и интерактивные комплексы, что </w:t>
+      </w:r>
+      <w:r>
+        <w:rPr>
+          <w:spacing w:val="-2"/>
+          <w:sz w:val="28"/>
+          <w:szCs w:val="28"/>
+        </w:rPr>
+        <w:lastRenderedPageBreak/>
+        <w:t>обеспечивает высокое качество учебного процесса. Лабораторный комплекс располагает всем необходимым оборудованием для проведения практических занятий, включая современные измерительные приборы, аналитическую технику и специализированное лабораторное оснащение.</w:t>
       </w:r>
     </w:p>
     <w:p>
@@ -5736,15 +5769,7 @@
           <w:sz w:val="28"/>
           <w:szCs w:val="28"/>
         </w:rPr>
-        <w:t xml:space="preserve">ысшее или среднее профессиональное образование </w:t>
-      </w:r>
-      <w:r>
-        <w:rPr>
-          <w:sz w:val="28"/>
-          <w:szCs w:val="28"/>
-        </w:rPr>
-        <w:lastRenderedPageBreak/>
-        <w:t>в рамках укрупненных групп специальностей и направлений подготовки высшего образования и специальностей среднего</w:t>
+        <w:t>ысшее или среднее профессиональное образование в рамках укрупненных групп специальностей и направлений подготовки высшего образования и специальностей среднего</w:t>
       </w:r>
       <w:r>
         <w:rPr>
@@ -6048,6 +6073,7 @@
           <w:sz w:val="28"/>
           <w:szCs w:val="28"/>
         </w:rPr>
+        <w:lastRenderedPageBreak/>
         <w:t>преподавателем</w:t>
       </w:r>
       <w:r>
@@ -6151,15 +6177,7 @@
           <w:sz w:val="28"/>
           <w:szCs w:val="28"/>
         </w:rPr>
-        <w:t xml:space="preserve">По основным разделам обучения предусмотрен промежуточный </w:t>
-      </w:r>
-      <w:r>
-        <w:rPr>
-          <w:sz w:val="28"/>
-          <w:szCs w:val="28"/>
-        </w:rPr>
-        <w:lastRenderedPageBreak/>
-        <w:t xml:space="preserve">контроль успеваемости в форме практической зачетной работы или опроса. </w:t>
+        <w:t xml:space="preserve">По основным разделам обучения предусмотрен промежуточный контроль успеваемости в форме практической зачетной работы или опроса. </w:t>
       </w:r>
     </w:p>
     <w:p>
@@ -6846,7 +6864,15 @@
           <w:sz w:val="28"/>
           <w:szCs w:val="28"/>
         </w:rPr>
-        <w:t>Для оценивания результатов обучения возможно использование таких типов контроля, как педагогическое наблюдение, педагогический анализ результатов анкетирования, мониторинг, опрос, тестирование, зачет, индивидуальное собеседование, письменные ответы на вопросы, выполнение практической работы и т.д.</w:t>
+        <w:t xml:space="preserve">Для оценивания результатов обучения возможно использование таких типов контроля, как педагогическое наблюдение, педагогический анализ результатов анкетирования, мониторинг, опрос, тестирование, зачет, </w:t>
+      </w:r>
+      <w:r>
+        <w:rPr>
+          <w:sz w:val="28"/>
+          <w:szCs w:val="28"/>
+        </w:rPr>
+        <w:lastRenderedPageBreak/>
+        <w:t>индивидуальное собеседование, письменные ответы на вопросы, выполнение практической работы и т.д.</w:t>
       </w:r>
     </w:p>
     <w:p>
@@ -7239,7 +7265,6 @@
           <w:sz w:val="28"/>
           <w:szCs w:val="28"/>
         </w:rPr>
-        <w:lastRenderedPageBreak/>
         <w:t>используются</w:t>
       </w:r>
       <w:r>
@@ -8375,6 +8400,7 @@
           <w:sz w:val="28"/>
           <w:szCs w:val="28"/>
         </w:rPr>
+        <w:lastRenderedPageBreak/>
         <w:t>умение</w:t>
       </w:r>
       <w:r>
@@ -8860,7 +8886,6 @@
           <w:sz w:val="28"/>
           <w:szCs w:val="28"/>
         </w:rPr>
-        <w:lastRenderedPageBreak/>
         <w:t>работы.</w:t>
       </w:r>
     </w:p>
@@ -10498,6 +10523,7 @@
           <w:sz w:val="28"/>
           <w:szCs w:val="28"/>
         </w:rPr>
+        <w:lastRenderedPageBreak/>
         <w:t xml:space="preserve">6.6. </w:t>
       </w:r>
       <w:r>
@@ -10843,7 +10869,6 @@
           <w:sz w:val="28"/>
           <w:szCs w:val="28"/>
         </w:rPr>
-        <w:lastRenderedPageBreak/>
         <w:t>понимание теоретических основ выполняемой работы;</w:t>
       </w:r>
     </w:p>
@@ -12026,6 +12051,7 @@
         <w:rPr>
           <w:spacing w:val="-2"/>
         </w:rPr>
+        <w:lastRenderedPageBreak/>
         <w:t xml:space="preserve">7.3. </w:t>
       </w:r>
       <w:r>
@@ -12252,7 +12278,6 @@
                 <w:sz w:val="28"/>
                 <w:szCs w:val="28"/>
               </w:rPr>
-              <w:lastRenderedPageBreak/>
               <w:t>${</w:t>
             </w:r>
             <w:proofErr w:type="spellStart"/>
@@ -12342,17 +12367,6 @@
           <w:sz w:val="28"/>
           <w:szCs w:val="28"/>
           <w:highlight w:val="yellow"/>
-        </w:rPr>
-      </w:pPr>
-    </w:p>
-    <w:p>
-      <w:pPr>
-        <w:pStyle w:val="Style13"/>
-        <w:widowControl/>
-        <w:rPr>
-          <w:rStyle w:val="FontStyle29"/>
-          <w:sz w:val="28"/>
-          <w:szCs w:val="28"/>
         </w:rPr>
       </w:pPr>
     </w:p>

</xml_diff>